<commit_message>
Ship Client Management Last N BD Client/Team emails, Pakistan holiday mail, Ignition, and template sort.
Consolidate end-of-month sidebar into Last 3/2/1 BD with Client|Team toggles, add holiday email scheduling, and sort email templates numerically by label.

Co-authored-by: Cursor <cursoragent@cursor.com>
</commit_message>
<xml_diff>
--- a/FireFly/Client Deadlines and Email Templates.docx
+++ b/FireFly/Client Deadlines and Email Templates.docx
@@ -54,124 +54,1069 @@
         <w:spacing w:after="120"/>
       </w:pPr>
       <w:r>
-        <w:t xml:space="preserve">We have based the timelines below on what is normal practice in the US and Canadian bookkeeping market. Practice in the two countries is very similar, so one cycle works for both. The idea is that the portal comes with this cycle built in. </w:t>
-      </w:r>
-      <w:r>
+        <w:t>We have based the timelines below on what is normal practice in the US and Canadian bookkeeping market. Practice in the two countries is very similar, so one cycle works for both. The idea is that the portal comes with this cycle built in. When we onboard a client, their monthly calendar, document requests, reminders and deadlines are set up automatically, and we can see at any point whether each step happened on time.</w:t>
+      </w:r>
+    </w:p>
+    <w:p>
+      <w:pPr>
+        <w:spacing w:after="120"/>
+      </w:pPr>
+      <w:r>
+        <w:t>This is bookkeeping only.</w:t>
+      </w:r>
+    </w:p>
+    <w:p>
+      <w:pPr>
+        <w:pStyle w:val="Heading1"/>
+      </w:pPr>
+      <w:r>
+        <w:t>1. How dates should work</w:t>
+      </w:r>
+    </w:p>
+    <w:p>
+      <w:pPr>
+        <w:pStyle w:val="ListParagraph"/>
+        <w:numPr>
+          <w:ilvl w:val="0"/>
+          <w:numId w:val="2"/>
+        </w:numPr>
+        <w:spacing w:after="60"/>
+      </w:pPr>
+      <w:r>
+        <w:t xml:space="preserve">The portal needs to understand business days. Throughout this document "BD5" means the fifth working day after month-end </w:t>
+      </w:r>
+      <w:r>
+        <w:t>whatever that day is</w:t>
+      </w:r>
+    </w:p>
+    <w:p>
+      <w:pPr>
+        <w:pStyle w:val="ListParagraph"/>
+        <w:numPr>
+          <w:ilvl w:val="0"/>
+          <w:numId w:val="2"/>
+        </w:numPr>
+        <w:spacing w:after="60"/>
+      </w:pPr>
+      <w:r>
+        <w:t>Business days should skip weekends and the holidays that apply to the client: US federal holidays for US clients, and Canadian statutory holidays (federal plus the client's province) for Canadian clients</w:t>
+      </w:r>
+      <w:r>
+        <w:t xml:space="preserve"> (unless a deadline is near and we are on a crunch)</w:t>
+      </w:r>
+    </w:p>
+    <w:p>
+      <w:pPr>
+        <w:pStyle w:val="ListParagraph"/>
+        <w:numPr>
+          <w:ilvl w:val="0"/>
+          <w:numId w:val="2"/>
+        </w:numPr>
+        <w:spacing w:after="60"/>
         <w:rPr>
           <w:highlight w:val="yellow"/>
         </w:rPr>
-        <w:t>When we onboard a client, their monthly calendar, document requests, reminders and deadlines are set up automatically, and we can see at any point whether each step happened on time.</w:t>
-      </w:r>
-    </w:p>
-    <w:p>
-      <w:pPr>
-        <w:spacing w:after="120"/>
-      </w:pPr>
-      <w:r>
-        <w:t>This is bookkeeping only.</w:t>
-      </w:r>
-    </w:p>
-    <w:p>
-      <w:pPr>
-        <w:pStyle w:val="Heading1"/>
-      </w:pPr>
-      <w:r>
-        <w:t>1. How dates should work</w:t>
-      </w:r>
-    </w:p>
-    <w:p>
-      <w:pPr>
-        <w:pStyle w:val="ListParagraph"/>
-        <w:numPr>
-          <w:ilvl w:val="0"/>
-          <w:numId w:val="2"/>
-        </w:numPr>
-        <w:spacing w:after="60"/>
-      </w:pPr>
-      <w:r>
-        <w:t xml:space="preserve">The portal needs to understand business days. Throughout this document </w:t>
-      </w:r>
+      </w:pPr>
       <w:r>
         <w:rPr>
           <w:highlight w:val="yellow"/>
         </w:rPr>
-        <w:t>"BD5</w:t>
-      </w:r>
-      <w:r>
-        <w:t xml:space="preserve">" means the fifth working day after month-end </w:t>
-      </w:r>
-      <w:r>
-        <w:t>whatever that day is</w:t>
-      </w:r>
-    </w:p>
-    <w:p>
-      <w:pPr>
-        <w:pStyle w:val="ListParagraph"/>
-        <w:numPr>
-          <w:ilvl w:val="0"/>
-          <w:numId w:val="2"/>
-        </w:numPr>
-        <w:spacing w:after="60"/>
-      </w:pPr>
+        <w:t>Every deadline below is a default. We need to be able to change the default for</w:t>
+      </w:r>
       <w:r>
         <w:rPr>
           <w:highlight w:val="yellow"/>
         </w:rPr>
-        <w:t>Business days should skip weekends and the holidays</w:t>
-      </w:r>
-      <w:r>
-        <w:t xml:space="preserve"> that apply to the client: US federal holidays for US clients, and Canadian statutory holidays (federal plus the client's province) for Canadian clients</w:t>
-      </w:r>
-      <w:r>
-        <w:t xml:space="preserve"> (unless a deadline is near and we are on a crunch)</w:t>
-      </w:r>
-    </w:p>
-    <w:p>
-      <w:pPr>
-        <w:pStyle w:val="ListParagraph"/>
-        <w:numPr>
-          <w:ilvl w:val="0"/>
-          <w:numId w:val="2"/>
-        </w:numPr>
-        <w:spacing w:after="60"/>
-      </w:pPr>
-      <w:r>
-        <w:t>Every deadline below is a default. We need to be able to change the default for</w:t>
-      </w:r>
-      <w:r>
         <w:t xml:space="preserve"> every client </w:t>
-      </w:r>
-      <w:r>
-        <w:t xml:space="preserve">(for example, a client with a </w:t>
-      </w:r>
-      <w:r>
-        <w:t>statutory requirement</w:t>
-      </w:r>
-      <w:r>
-        <w:t xml:space="preserve"> who needs financials by BD10).</w:t>
-      </w:r>
-    </w:p>
-    <w:p>
-      <w:pPr>
-        <w:pStyle w:val="ListParagraph"/>
-        <w:numPr>
-          <w:ilvl w:val="0"/>
-          <w:numId w:val="2"/>
-        </w:numPr>
-        <w:spacing w:after="60"/>
-      </w:pPr>
-      <w:r>
-        <w:t xml:space="preserve">Our team works from Pakistan, so the </w:t>
       </w:r>
       <w:r>
         <w:rPr>
           <w:highlight w:val="yellow"/>
         </w:rPr>
-        <w:t>portal should show times in both the client's own time zone (Eastern through Pacific, including Atlantic Canada) and Pakistan time,</w:t>
-      </w:r>
-      <w:r>
-        <w:t xml:space="preserve"> and handle Pakistani public holidays (Eid in particular) for staff capacity planning, without changing the client-facing dates.</w:t>
-      </w:r>
+        <w:t xml:space="preserve">(for example, a client with a </w:t>
+      </w:r>
+      <w:r>
+        <w:rPr>
+          <w:highlight w:val="yellow"/>
+        </w:rPr>
+        <w:t>statutory requirement</w:t>
+      </w:r>
+      <w:r>
+        <w:rPr>
+          <w:highlight w:val="yellow"/>
+        </w:rPr>
+        <w:t xml:space="preserve"> who needs financials by BD10).</w:t>
+      </w:r>
+    </w:p>
+    <w:p>
+      <w:pPr>
+        <w:pStyle w:val="ListParagraph"/>
+        <w:numPr>
+          <w:ilvl w:val="0"/>
+          <w:numId w:val="2"/>
+        </w:numPr>
+        <w:spacing w:after="60"/>
+      </w:pPr>
+      <w:r>
+        <w:t xml:space="preserve">Our team works from Pakistan, so the </w:t>
+      </w:r>
+      <w:r>
+        <w:rPr>
+          <w:highlight w:val="yellow"/>
+        </w:rPr>
+        <w:t>portal should show times in both</w:t>
+      </w:r>
+      <w:r>
+        <w:t xml:space="preserve"> the client's own time zone (Eastern through Pacific, including Atlantic Canada) and Pakistan time, and handle Pakistani public holidays (Eid in particular) for staff capacity planning, without changing the client-facing dates.</w:t>
+      </w:r>
+    </w:p>
+    <w:p>
+      <w:pPr>
+        <w:spacing w:after="60"/>
+      </w:pPr>
+      <w:r>
+        <w:rPr>
+          <w:noProof/>
+        </w:rPr>
+        <w:drawing>
+          <wp:inline distT="0" distB="0" distL="0" distR="0" wp14:anchorId="2DA7441D" wp14:editId="59D5B491">
+            <wp:extent cx="5943600" cy="2301875"/>
+            <wp:effectExtent l="0" t="0" r="0" b="3175"/>
+            <wp:docPr id="100167697" name="Picture 1"/>
+            <wp:cNvGraphicFramePr>
+              <a:graphicFrameLocks xmlns:a="http://schemas.openxmlformats.org/drawingml/2006/main" noChangeAspect="1"/>
+            </wp:cNvGraphicFramePr>
+            <a:graphic xmlns:a="http://schemas.openxmlformats.org/drawingml/2006/main">
+              <a:graphicData uri="http://schemas.openxmlformats.org/drawingml/2006/picture">
+                <pic:pic xmlns:pic="http://schemas.openxmlformats.org/drawingml/2006/picture">
+                  <pic:nvPicPr>
+                    <pic:cNvPr id="100167697" name=""/>
+                    <pic:cNvPicPr/>
+                  </pic:nvPicPr>
+                  <pic:blipFill>
+                    <a:blip r:embed="rId8"/>
+                    <a:stretch>
+                      <a:fillRect/>
+                    </a:stretch>
+                  </pic:blipFill>
+                  <pic:spPr>
+                    <a:xfrm>
+                      <a:off x="0" y="0"/>
+                      <a:ext cx="5943600" cy="2301875"/>
+                    </a:xfrm>
+                    <a:prstGeom prst="rect">
+                      <a:avLst/>
+                    </a:prstGeom>
+                  </pic:spPr>
+                </pic:pic>
+              </a:graphicData>
+            </a:graphic>
+          </wp:inline>
+        </w:drawing>
+      </w:r>
+    </w:p>
+    <w:p>
+      <w:pPr>
+        <w:spacing w:after="60"/>
+        <w:rPr>
+          <w:b/>
+          <w:bCs/>
+        </w:rPr>
+      </w:pPr>
+      <w:r>
+        <w:rPr>
+          <w:b/>
+          <w:bCs/>
+        </w:rPr>
+        <w:t>Rules</w:t>
+      </w:r>
+    </w:p>
+    <w:p>
+      <w:pPr>
+        <w:numPr>
+          <w:ilvl w:val="0"/>
+          <w:numId w:val="3"/>
+        </w:numPr>
+        <w:spacing w:after="60"/>
+      </w:pPr>
+      <w:r>
+        <w:t>If holiday ≠ a scheduled BD → ignore for email timing.</w:t>
+      </w:r>
+    </w:p>
+    <w:p>
+      <w:pPr>
+        <w:numPr>
+          <w:ilvl w:val="0"/>
+          <w:numId w:val="3"/>
+        </w:numPr>
+        <w:spacing w:after="60"/>
+      </w:pPr>
+      <w:r>
+        <w:t>If holiday = a scheduled BD → that BD’s email moves to the next business day.</w:t>
+      </w:r>
+    </w:p>
+    <w:p>
+      <w:pPr>
+        <w:numPr>
+          <w:ilvl w:val="0"/>
+          <w:numId w:val="3"/>
+        </w:numPr>
+        <w:spacing w:after="60"/>
+      </w:pPr>
+      <w:r>
+        <w:t>Later scheduled BDs are not cascade-shifted.</w:t>
+      </w:r>
+    </w:p>
+    <w:p>
+      <w:pPr>
+        <w:spacing w:after="60"/>
+      </w:pPr>
+      <w:r>
+        <w:lastRenderedPageBreak/>
+        <w:t>“Next BD” = the next working day after the holiday date, skipping weekends and any other holidays.</w:t>
+      </w:r>
+    </w:p>
+    <w:p>
+      <w:pPr>
+        <w:spacing w:after="60"/>
+      </w:pPr>
+    </w:p>
+    <w:p>
+      <w:pPr>
+        <w:spacing w:after="60"/>
+        <w:rPr>
+          <w:b/>
+          <w:bCs/>
+        </w:rPr>
+      </w:pPr>
+      <w:r>
+        <w:rPr>
+          <w:b/>
+          <w:bCs/>
+        </w:rPr>
+        <w:t>Calculation</w:t>
+      </w:r>
+    </w:p>
+    <w:p>
+      <w:pPr>
+        <w:numPr>
+          <w:ilvl w:val="0"/>
+          <w:numId w:val="4"/>
+        </w:numPr>
+        <w:spacing w:after="60"/>
+      </w:pPr>
+      <w:r>
+        <w:t>Sidebar BD dates and email schedule times use business days that exclude weekends and holidays.</w:t>
+      </w:r>
+    </w:p>
+    <w:p>
+      <w:pPr>
+        <w:numPr>
+          <w:ilvl w:val="0"/>
+          <w:numId w:val="4"/>
+        </w:numPr>
+        <w:spacing w:after="60"/>
+      </w:pPr>
+      <w:r>
+        <w:t>This is recalculated every month.</w:t>
+      </w:r>
+    </w:p>
+    <w:p>
+      <w:pPr>
+        <w:spacing w:after="60"/>
+        <w:rPr>
+          <w:b/>
+          <w:bCs/>
+        </w:rPr>
+      </w:pPr>
+      <w:r>
+        <w:rPr>
+          <w:b/>
+          <w:bCs/>
+        </w:rPr>
+        <w:t>Holiday on a scheduled BD</w:t>
+      </w:r>
+    </w:p>
+    <w:p>
+      <w:pPr>
+        <w:numPr>
+          <w:ilvl w:val="0"/>
+          <w:numId w:val="5"/>
+        </w:numPr>
+        <w:spacing w:after="60"/>
+      </w:pPr>
+      <w:r>
+        <w:t>If that BD’s date is a holiday, that email moves to the next working day (again skipping weekends + holidays).</w:t>
+      </w:r>
+    </w:p>
+    <w:p>
+      <w:pPr>
+        <w:numPr>
+          <w:ilvl w:val="0"/>
+          <w:numId w:val="5"/>
+        </w:numPr>
+        <w:spacing w:after="60"/>
+      </w:pPr>
+      <w:r>
+        <w:t>Other BDs stay on their own dates (e.g. BD5 → next working day; BD8 unchanged).</w:t>
+      </w:r>
+    </w:p>
+    <w:p>
+      <w:pPr>
+        <w:spacing w:after="60"/>
+        <w:rPr>
+          <w:b/>
+          <w:bCs/>
+        </w:rPr>
+      </w:pPr>
+      <w:r>
+        <w:rPr>
+          <w:b/>
+          <w:bCs/>
+        </w:rPr>
+        <w:t>Holiday between scheduled BDs</w:t>
+      </w:r>
+    </w:p>
+    <w:p>
+      <w:pPr>
+        <w:numPr>
+          <w:ilvl w:val="0"/>
+          <w:numId w:val="6"/>
+        </w:numPr>
+        <w:spacing w:after="60"/>
+      </w:pPr>
+      <w:r>
+        <w:t>e.g. holiday on BD3, emails on BD1 / BD5 / BD8 → no special cascade; those BDs keep their normal month calculation.</w:t>
+      </w:r>
+    </w:p>
+    <w:p>
+      <w:pPr>
+        <w:spacing w:after="60"/>
+      </w:pPr>
+    </w:p>
+    <w:p>
+      <w:pPr>
+        <w:spacing w:after="60"/>
+      </w:pPr>
+      <w:r>
+        <w:t>BD1 Deadline BD4….</w:t>
+      </w:r>
+    </w:p>
+    <w:p>
+      <w:pPr>
+        <w:spacing w:after="60"/>
+      </w:pPr>
+      <w:r>
+        <w:t>BD7 Deadline is BD8 but if there is weekend on BD8 then BD7 deadline is BD7</w:t>
+      </w:r>
+    </w:p>
+    <w:p>
+      <w:pPr>
+        <w:spacing w:after="60"/>
+      </w:pPr>
+      <w:r>
+        <w:t>BD8 deadline is BD8</w:t>
+      </w:r>
+    </w:p>
+    <w:p>
+      <w:pPr>
+        <w:spacing w:after="60"/>
+      </w:pPr>
+    </w:p>
+    <w:p>
+      <w:pPr>
+        <w:spacing w:after="60"/>
+      </w:pPr>
+    </w:p>
+    <w:p>
+      <w:pPr>
+        <w:spacing w:after="60"/>
+      </w:pPr>
+    </w:p>
+    <w:p>
+      <w:pPr>
+        <w:spacing w:after="60"/>
+      </w:pPr>
+    </w:p>
+    <w:p>
+      <w:pPr>
+        <w:spacing w:after="60"/>
+      </w:pPr>
+      <w:r>
+        <w:t>Emails go out at 9:00 AM Pakistan time on the last weekday before the holiday (or holiday series):</w:t>
+      </w:r>
+    </w:p>
+    <w:p>
+      <w:pPr>
+        <w:numPr>
+          <w:ilvl w:val="0"/>
+          <w:numId w:val="7"/>
+        </w:numPr>
+        <w:spacing w:after="60"/>
+      </w:pPr>
+      <w:r>
+        <w:t>Day before is Mon–Fri → send that day</w:t>
+      </w:r>
+    </w:p>
+    <w:p>
+      <w:pPr>
+        <w:numPr>
+          <w:ilvl w:val="0"/>
+          <w:numId w:val="7"/>
+        </w:numPr>
+        <w:spacing w:after="60"/>
+      </w:pPr>
+      <w:r>
+        <w:t>Day before is Sat/Sun → roll back to Friday</w:t>
+      </w:r>
+    </w:p>
+    <w:p>
+      <w:pPr>
+        <w:spacing w:after="60"/>
+      </w:pPr>
+      <w:r>
+        <w:t>Example: Monday holiday → Friday send.</w:t>
+      </w:r>
+    </w:p>
+    <w:p>
+      <w:pPr>
+        <w:spacing w:after="60"/>
+      </w:pPr>
+    </w:p>
+    <w:p>
+      <w:pPr>
+        <w:spacing w:after="60"/>
+      </w:pPr>
+    </w:p>
+    <w:p>
+      <w:pPr>
+        <w:spacing w:after="60"/>
+      </w:pPr>
+    </w:p>
+    <w:p>
+      <w:pPr>
+        <w:spacing w:after="60"/>
+      </w:pPr>
+      <w:r>
+        <w:t>Yes — here’s what’s in place:</w:t>
+      </w:r>
+    </w:p>
+    <w:p>
+      <w:pPr>
+        <w:spacing w:after="60"/>
+      </w:pPr>
+      <w:r>
+        <w:t>Client emails (Template 17)</w:t>
+      </w:r>
+    </w:p>
+    <w:p>
+      <w:pPr>
+        <w:numPr>
+          <w:ilvl w:val="0"/>
+          <w:numId w:val="8"/>
+        </w:numPr>
+        <w:spacing w:after="60"/>
+      </w:pPr>
+      <w:r>
+        <w:t>Count 15 calendar days before the holiday (Sat/Sun included)</w:t>
+      </w:r>
+    </w:p>
+    <w:p>
+      <w:pPr>
+        <w:numPr>
+          <w:ilvl w:val="0"/>
+          <w:numId w:val="8"/>
+        </w:numPr>
+        <w:spacing w:after="60"/>
+      </w:pPr>
+      <w:r>
+        <w:t>If that date is a weekend → send on the previous Friday</w:t>
+      </w:r>
+    </w:p>
+    <w:p>
+      <w:pPr>
+        <w:numPr>
+          <w:ilvl w:val="0"/>
+          <w:numId w:val="8"/>
+        </w:numPr>
+        <w:spacing w:after="60"/>
+      </w:pPr>
+      <w:r>
+        <w:t>9:00 AM Pakistan time</w:t>
+      </w:r>
+    </w:p>
+    <w:p>
+      <w:pPr>
+        <w:numPr>
+          <w:ilvl w:val="0"/>
+          <w:numId w:val="8"/>
+        </w:numPr>
+        <w:spacing w:after="60"/>
+      </w:pPr>
+      <w:r>
+        <w:t>Same multi-day grouping (one email for Eid Day 1–3, etc.)</w:t>
+      </w:r>
+    </w:p>
+    <w:p>
+      <w:pPr>
+        <w:numPr>
+          <w:ilvl w:val="0"/>
+          <w:numId w:val="8"/>
+        </w:numPr>
+        <w:spacing w:after="60"/>
+      </w:pPr>
+      <w:r>
+        <w:t>Recipients: all Client Profile emails (POC, document request, financials, owner)</w:t>
+      </w:r>
+    </w:p>
+    <w:p>
+      <w:pPr>
+        <w:numPr>
+          <w:ilvl w:val="0"/>
+          <w:numId w:val="8"/>
+        </w:numPr>
+        <w:spacing w:after="60"/>
+      </w:pPr>
+      <w:r>
+        <w:t xml:space="preserve">Only ayesha@fireflyaccountancy.com can </w:t>
+      </w:r>
+      <w:proofErr w:type="spellStart"/>
+      <w:r>
+        <w:t>sen</w:t>
+      </w:r>
+      <w:proofErr w:type="spellEnd"/>
+    </w:p>
+    <w:p>
+      <w:pPr>
+        <w:spacing w:after="60"/>
+      </w:pPr>
+    </w:p>
+    <w:p>
+      <w:pPr>
+        <w:spacing w:after="60"/>
+      </w:pPr>
+    </w:p>
+    <w:p>
+      <w:pPr>
+        <w:spacing w:after="60"/>
+      </w:pPr>
+    </w:p>
+    <w:p>
+      <w:pPr>
+        <w:spacing w:after="60"/>
+      </w:pPr>
+    </w:p>
+    <w:p>
+      <w:pPr>
+        <w:spacing w:after="60"/>
+      </w:pPr>
+      <w:r>
+        <w:lastRenderedPageBreak/>
+        <w:t>Each </w:t>
+      </w:r>
+      <w:proofErr w:type="spellStart"/>
+      <w:r>
+        <w:t>timezone</w:t>
+      </w:r>
+      <w:proofErr w:type="spellEnd"/>
+      <w:r>
+        <w:t xml:space="preserve"> group gets its own send:</w:t>
+      </w:r>
+    </w:p>
+    <w:tbl>
+      <w:tblPr>
+        <w:tblW w:w="0" w:type="auto"/>
+        <w:tblCellSpacing w:w="15" w:type="dxa"/>
+        <w:tblCellMar>
+          <w:top w:w="15" w:type="dxa"/>
+          <w:left w:w="15" w:type="dxa"/>
+          <w:bottom w:w="15" w:type="dxa"/>
+          <w:right w:w="15" w:type="dxa"/>
+        </w:tblCellMar>
+        <w:tblLook w:val="04A0" w:firstRow="1" w:lastRow="0" w:firstColumn="1" w:lastColumn="0" w:noHBand="0" w:noVBand="1"/>
+      </w:tblPr>
+      <w:tblGrid>
+        <w:gridCol w:w="1016"/>
+        <w:gridCol w:w="3251"/>
+      </w:tblGrid>
+      <w:tr>
+        <w:trPr>
+          <w:tblHeader/>
+          <w:tblCellSpacing w:w="15" w:type="dxa"/>
+        </w:trPr>
+        <w:tc>
+          <w:tcPr>
+            <w:tcW w:w="0" w:type="auto"/>
+            <w:noWrap/>
+            <w:tcMar>
+              <w:top w:w="90" w:type="dxa"/>
+              <w:left w:w="150" w:type="dxa"/>
+              <w:bottom w:w="90" w:type="dxa"/>
+              <w:right w:w="150" w:type="dxa"/>
+            </w:tcMar>
+            <w:hideMark/>
+          </w:tcPr>
+          <w:p>
+            <w:pPr>
+              <w:spacing w:after="60"/>
+              <w:rPr>
+                <w:b/>
+                <w:bCs/>
+              </w:rPr>
+            </w:pPr>
+            <w:r>
+              <w:rPr>
+                <w:b/>
+                <w:bCs/>
+              </w:rPr>
+              <w:t>Field</w:t>
+            </w:r>
+          </w:p>
+        </w:tc>
+        <w:tc>
+          <w:tcPr>
+            <w:tcW w:w="0" w:type="auto"/>
+            <w:noWrap/>
+            <w:tcMar>
+              <w:top w:w="90" w:type="dxa"/>
+              <w:left w:w="150" w:type="dxa"/>
+              <w:bottom w:w="90" w:type="dxa"/>
+              <w:right w:w="150" w:type="dxa"/>
+            </w:tcMar>
+            <w:hideMark/>
+          </w:tcPr>
+          <w:p>
+            <w:pPr>
+              <w:spacing w:after="60"/>
+              <w:rPr>
+                <w:b/>
+                <w:bCs/>
+              </w:rPr>
+            </w:pPr>
+            <w:r>
+              <w:rPr>
+                <w:b/>
+                <w:bCs/>
+              </w:rPr>
+              <w:t>Value</w:t>
+            </w:r>
+          </w:p>
+        </w:tc>
+      </w:tr>
+      <w:tr>
+        <w:trPr>
+          <w:tblCellSpacing w:w="15" w:type="dxa"/>
+        </w:trPr>
+        <w:tc>
+          <w:tcPr>
+            <w:tcW w:w="0" w:type="auto"/>
+            <w:tcMar>
+              <w:top w:w="90" w:type="dxa"/>
+              <w:left w:w="150" w:type="dxa"/>
+              <w:bottom w:w="90" w:type="dxa"/>
+              <w:right w:w="150" w:type="dxa"/>
+            </w:tcMar>
+            <w:hideMark/>
+          </w:tcPr>
+          <w:p>
+            <w:pPr>
+              <w:spacing w:after="60"/>
+            </w:pPr>
+            <w:r>
+              <w:t>To</w:t>
+            </w:r>
+          </w:p>
+        </w:tc>
+        <w:tc>
+          <w:tcPr>
+            <w:tcW w:w="0" w:type="auto"/>
+            <w:tcMar>
+              <w:top w:w="90" w:type="dxa"/>
+              <w:left w:w="150" w:type="dxa"/>
+              <w:bottom w:w="90" w:type="dxa"/>
+              <w:right w:w="150" w:type="dxa"/>
+            </w:tcMar>
+            <w:hideMark/>
+          </w:tcPr>
+          <w:p>
+            <w:pPr>
+              <w:spacing w:after="60"/>
+            </w:pPr>
+            <w:r>
+              <w:t>ayesha@fireflyaccountancy.com</w:t>
+            </w:r>
+          </w:p>
+        </w:tc>
+      </w:tr>
+      <w:tr>
+        <w:trPr>
+          <w:tblCellSpacing w:w="15" w:type="dxa"/>
+        </w:trPr>
+        <w:tc>
+          <w:tcPr>
+            <w:tcW w:w="0" w:type="auto"/>
+            <w:tcMar>
+              <w:top w:w="90" w:type="dxa"/>
+              <w:left w:w="150" w:type="dxa"/>
+              <w:bottom w:w="90" w:type="dxa"/>
+              <w:right w:w="150" w:type="dxa"/>
+            </w:tcMar>
+            <w:hideMark/>
+          </w:tcPr>
+          <w:p>
+            <w:pPr>
+              <w:spacing w:after="60"/>
+            </w:pPr>
+            <w:r>
+              <w:t>BCC</w:t>
+            </w:r>
+          </w:p>
+        </w:tc>
+        <w:tc>
+          <w:tcPr>
+            <w:tcW w:w="0" w:type="auto"/>
+            <w:tcMar>
+              <w:top w:w="90" w:type="dxa"/>
+              <w:left w:w="150" w:type="dxa"/>
+              <w:bottom w:w="90" w:type="dxa"/>
+              <w:right w:w="150" w:type="dxa"/>
+            </w:tcMar>
+            <w:hideMark/>
+          </w:tcPr>
+          <w:p>
+            <w:pPr>
+              <w:spacing w:after="60"/>
+            </w:pPr>
+            <w:r>
+              <w:t xml:space="preserve">only clients in that </w:t>
+            </w:r>
+            <w:proofErr w:type="spellStart"/>
+            <w:r>
+              <w:t>timezone</w:t>
+            </w:r>
+            <w:proofErr w:type="spellEnd"/>
+          </w:p>
+        </w:tc>
+      </w:tr>
+      <w:tr>
+        <w:trPr>
+          <w:tblCellSpacing w:w="15" w:type="dxa"/>
+        </w:trPr>
+        <w:tc>
+          <w:tcPr>
+            <w:tcW w:w="0" w:type="auto"/>
+            <w:tcMar>
+              <w:top w:w="90" w:type="dxa"/>
+              <w:left w:w="150" w:type="dxa"/>
+              <w:bottom w:w="90" w:type="dxa"/>
+              <w:right w:w="150" w:type="dxa"/>
+            </w:tcMar>
+            <w:hideMark/>
+          </w:tcPr>
+          <w:p>
+            <w:pPr>
+              <w:spacing w:after="60"/>
+            </w:pPr>
+            <w:r>
+              <w:t>Send at</w:t>
+            </w:r>
+          </w:p>
+        </w:tc>
+        <w:tc>
+          <w:tcPr>
+            <w:tcW w:w="0" w:type="auto"/>
+            <w:tcMar>
+              <w:top w:w="90" w:type="dxa"/>
+              <w:left w:w="150" w:type="dxa"/>
+              <w:bottom w:w="90" w:type="dxa"/>
+              <w:right w:w="150" w:type="dxa"/>
+            </w:tcMar>
+            <w:hideMark/>
+          </w:tcPr>
+          <w:p>
+            <w:pPr>
+              <w:spacing w:after="60"/>
+            </w:pPr>
+            <w:r>
+              <w:t xml:space="preserve">9:00 AM in that </w:t>
+            </w:r>
+            <w:proofErr w:type="spellStart"/>
+            <w:r>
+              <w:t>timezone</w:t>
+            </w:r>
+            <w:proofErr w:type="spellEnd"/>
+          </w:p>
+        </w:tc>
+      </w:tr>
+    </w:tbl>
+    <w:p>
+      <w:pPr>
+        <w:spacing w:after="60"/>
+      </w:pPr>
+      <w:r>
+        <w:t>Example: EST clients → one email (BCC = EST list, 9 AM Eastern). PST clients → another email (BCC = PST list, 9 AM Pacific). Clients never see each other’s addresses.</w:t>
+      </w:r>
+    </w:p>
+    <w:p>
+      <w:pPr>
+        <w:spacing w:after="60"/>
+      </w:pPr>
+      <w:r>
+        <w:t>Both can be scheduled — same Graph deferred send.</w:t>
+      </w:r>
+    </w:p>
+    <w:tbl>
+      <w:tblPr>
+        <w:tblW w:w="0" w:type="auto"/>
+        <w:tblCellSpacing w:w="15" w:type="dxa"/>
+        <w:tblCellMar>
+          <w:top w:w="15" w:type="dxa"/>
+          <w:left w:w="15" w:type="dxa"/>
+          <w:bottom w:w="15" w:type="dxa"/>
+          <w:right w:w="15" w:type="dxa"/>
+        </w:tblCellMar>
+        <w:tblLook w:val="04A0" w:firstRow="1" w:lastRow="0" w:firstColumn="1" w:lastColumn="0" w:noHBand="0" w:noVBand="1"/>
+      </w:tblPr>
+      <w:tblGrid>
+        <w:gridCol w:w="863"/>
+        <w:gridCol w:w="6128"/>
+        <w:gridCol w:w="2369"/>
+      </w:tblGrid>
+      <w:tr>
+        <w:trPr>
+          <w:tblHeader/>
+          <w:tblCellSpacing w:w="15" w:type="dxa"/>
+        </w:trPr>
+        <w:tc>
+          <w:tcPr>
+            <w:tcW w:w="0" w:type="auto"/>
+            <w:noWrap/>
+            <w:tcMar>
+              <w:top w:w="90" w:type="dxa"/>
+              <w:left w:w="150" w:type="dxa"/>
+              <w:bottom w:w="90" w:type="dxa"/>
+              <w:right w:w="150" w:type="dxa"/>
+            </w:tcMar>
+            <w:hideMark/>
+          </w:tcPr>
+          <w:p>
+            <w:pPr>
+              <w:spacing w:after="60"/>
+            </w:pPr>
+          </w:p>
+        </w:tc>
+        <w:tc>
+          <w:tcPr>
+            <w:tcW w:w="0" w:type="auto"/>
+            <w:noWrap/>
+            <w:tcMar>
+              <w:top w:w="90" w:type="dxa"/>
+              <w:left w:w="150" w:type="dxa"/>
+              <w:bottom w:w="90" w:type="dxa"/>
+              <w:right w:w="150" w:type="dxa"/>
+            </w:tcMar>
+            <w:hideMark/>
+          </w:tcPr>
+          <w:p>
+            <w:pPr>
+              <w:spacing w:after="60"/>
+              <w:rPr>
+                <w:b/>
+                <w:bCs/>
+              </w:rPr>
+            </w:pPr>
+            <w:r>
+              <w:rPr>
+                <w:b/>
+                <w:bCs/>
+              </w:rPr>
+              <w:t>When it schedules</w:t>
+            </w:r>
+          </w:p>
+        </w:tc>
+        <w:tc>
+          <w:tcPr>
+            <w:tcW w:w="0" w:type="auto"/>
+            <w:noWrap/>
+            <w:tcMar>
+              <w:top w:w="90" w:type="dxa"/>
+              <w:left w:w="150" w:type="dxa"/>
+              <w:bottom w:w="90" w:type="dxa"/>
+              <w:right w:w="150" w:type="dxa"/>
+            </w:tcMar>
+            <w:hideMark/>
+          </w:tcPr>
+          <w:p>
+            <w:pPr>
+              <w:spacing w:after="60"/>
+              <w:rPr>
+                <w:b/>
+                <w:bCs/>
+              </w:rPr>
+            </w:pPr>
+            <w:r>
+              <w:rPr>
+                <w:b/>
+                <w:bCs/>
+              </w:rPr>
+              <w:t>When it sends now</w:t>
+            </w:r>
+          </w:p>
+        </w:tc>
+      </w:tr>
+      <w:tr>
+        <w:trPr>
+          <w:tblCellSpacing w:w="15" w:type="dxa"/>
+        </w:trPr>
+        <w:tc>
+          <w:tcPr>
+            <w:tcW w:w="0" w:type="auto"/>
+            <w:tcMar>
+              <w:top w:w="90" w:type="dxa"/>
+              <w:left w:w="150" w:type="dxa"/>
+              <w:bottom w:w="90" w:type="dxa"/>
+              <w:right w:w="150" w:type="dxa"/>
+            </w:tcMar>
+            <w:hideMark/>
+          </w:tcPr>
+          <w:p>
+            <w:pPr>
+              <w:spacing w:after="60"/>
+            </w:pPr>
+            <w:r>
+              <w:t>Team</w:t>
+            </w:r>
+          </w:p>
+        </w:tc>
+        <w:tc>
+          <w:tcPr>
+            <w:tcW w:w="0" w:type="auto"/>
+            <w:tcMar>
+              <w:top w:w="90" w:type="dxa"/>
+              <w:left w:w="150" w:type="dxa"/>
+              <w:bottom w:w="90" w:type="dxa"/>
+              <w:right w:w="150" w:type="dxa"/>
+            </w:tcMar>
+            <w:hideMark/>
+          </w:tcPr>
+          <w:p>
+            <w:pPr>
+              <w:spacing w:after="60"/>
+            </w:pPr>
+            <w:r>
+              <w:t>9:00 AM Pakistan time on the last weekday before the holiday is still in the future</w:t>
+            </w:r>
+          </w:p>
+        </w:tc>
+        <w:tc>
+          <w:tcPr>
+            <w:tcW w:w="0" w:type="auto"/>
+            <w:tcMar>
+              <w:top w:w="90" w:type="dxa"/>
+              <w:left w:w="150" w:type="dxa"/>
+              <w:bottom w:w="90" w:type="dxa"/>
+              <w:right w:w="150" w:type="dxa"/>
+            </w:tcMar>
+            <w:hideMark/>
+          </w:tcPr>
+          <w:p>
+            <w:pPr>
+              <w:spacing w:after="60"/>
+            </w:pPr>
+            <w:r>
+              <w:t>That time already passed</w:t>
+            </w:r>
+          </w:p>
+        </w:tc>
+      </w:tr>
+      <w:tr>
+        <w:trPr>
+          <w:tblCellSpacing w:w="15" w:type="dxa"/>
+        </w:trPr>
+        <w:tc>
+          <w:tcPr>
+            <w:tcW w:w="0" w:type="auto"/>
+            <w:tcMar>
+              <w:top w:w="90" w:type="dxa"/>
+              <w:left w:w="150" w:type="dxa"/>
+              <w:bottom w:w="90" w:type="dxa"/>
+              <w:right w:w="150" w:type="dxa"/>
+            </w:tcMar>
+            <w:hideMark/>
+          </w:tcPr>
+          <w:p>
+            <w:pPr>
+              <w:spacing w:after="60"/>
+            </w:pPr>
+            <w:r>
+              <w:t>Client</w:t>
+            </w:r>
+          </w:p>
+        </w:tc>
+        <w:tc>
+          <w:tcPr>
+            <w:tcW w:w="0" w:type="auto"/>
+            <w:tcMar>
+              <w:top w:w="90" w:type="dxa"/>
+              <w:left w:w="150" w:type="dxa"/>
+              <w:bottom w:w="90" w:type="dxa"/>
+              <w:right w:w="150" w:type="dxa"/>
+            </w:tcMar>
+            <w:hideMark/>
+          </w:tcPr>
+          <w:p>
+            <w:pPr>
+              <w:spacing w:after="60"/>
+            </w:pPr>
+            <w:r>
+              <w:t>9:00 AM in the client’s time zone on the 15-calendar-day (weekday-adjusted) date is still in the future</w:t>
+            </w:r>
+          </w:p>
+        </w:tc>
+        <w:tc>
+          <w:tcPr>
+            <w:tcW w:w="0" w:type="auto"/>
+            <w:tcMar>
+              <w:top w:w="90" w:type="dxa"/>
+              <w:left w:w="150" w:type="dxa"/>
+              <w:bottom w:w="90" w:type="dxa"/>
+              <w:right w:w="150" w:type="dxa"/>
+            </w:tcMar>
+            <w:hideMark/>
+          </w:tcPr>
+          <w:p>
+            <w:pPr>
+              <w:spacing w:after="60"/>
+            </w:pPr>
+            <w:r>
+              <w:t>That time already passed</w:t>
+            </w:r>
+          </w:p>
+        </w:tc>
+      </w:tr>
+    </w:tbl>
+    <w:p>
+      <w:pPr>
+        <w:spacing w:after="60"/>
+      </w:pPr>
+      <w:r>
+        <w:t>So if a holiday is less than ~15 days away, team can still show Scheduled (day-before is ahead) while client goes Sent immediately (the 15-day window already passed). That’s expected with the current rules.</w:t>
+      </w:r>
+    </w:p>
+    <w:p>
+      <w:pPr>
+        <w:spacing w:after="60"/>
+      </w:pPr>
+    </w:p>
+    <w:p>
+      <w:pPr>
+        <w:spacing w:after="60"/>
+      </w:pPr>
+    </w:p>
+    <w:p>
+      <w:pPr>
+        <w:spacing w:after="60"/>
+      </w:pPr>
     </w:p>
     <w:p>
       <w:pPr>
@@ -188,89 +1133,6 @@
       <w:r>
         <w:t>This is the cycle the portal should run every month for each client on a monthly service. Each row should become a task or an automatic action with an owner and a due date.</w:t>
       </w:r>
-    </w:p>
-    <w:p>
-      <w:pPr>
-        <w:spacing w:after="120"/>
-      </w:pPr>
-    </w:p>
-    <w:p>
-      <w:pPr>
-        <w:spacing w:after="120"/>
-      </w:pPr>
-      <w:r>
-        <w:t xml:space="preserve">Client A, Monthly </w:t>
-      </w:r>
-      <w:proofErr w:type="gramStart"/>
-      <w:r>
-        <w:t>book keeping</w:t>
-      </w:r>
-      <w:proofErr w:type="gramEnd"/>
-      <w:r>
-        <w:t xml:space="preserve"> …. 8 oct…</w:t>
-      </w:r>
-    </w:p>
-    <w:p>
-      <w:pPr>
-        <w:spacing w:after="120"/>
-      </w:pPr>
-      <w:r>
-        <w:t xml:space="preserve">BD3 28 </w:t>
-      </w:r>
-      <w:r>
-        <w:t>……. reminders</w:t>
-      </w:r>
-    </w:p>
-    <w:p>
-      <w:pPr>
-        <w:spacing w:after="120"/>
-      </w:pPr>
-      <w:r>
-        <w:t>BD</w:t>
-      </w:r>
-      <w:proofErr w:type="gramStart"/>
-      <w:r>
-        <w:t>2  29</w:t>
-      </w:r>
-      <w:proofErr w:type="gramEnd"/>
-      <w:r>
-        <w:t xml:space="preserve"> </w:t>
-      </w:r>
-      <w:r>
-        <w:t>……. reminders</w:t>
-      </w:r>
-    </w:p>
-    <w:p>
-      <w:pPr>
-        <w:spacing w:after="120"/>
-      </w:pPr>
-      <w:r>
-        <w:t xml:space="preserve">BD1 30 oct ……. </w:t>
-      </w:r>
-      <w:r>
-        <w:t>R</w:t>
-      </w:r>
-      <w:r>
-        <w:t>eminders</w:t>
-      </w:r>
-    </w:p>
-    <w:p>
-      <w:pPr>
-        <w:spacing w:after="120"/>
-      </w:pPr>
-    </w:p>
-    <w:p>
-      <w:pPr>
-        <w:spacing w:after="120"/>
-      </w:pPr>
-      <w:r>
-        <w:t xml:space="preserve">BD1 …. 2 Nov …. Client ko email…. </w:t>
-      </w:r>
-    </w:p>
-    <w:p>
-      <w:pPr>
-        <w:spacing w:after="120"/>
-      </w:pPr>
     </w:p>
     <w:p>
       <w:pPr>
@@ -650,6 +1512,7 @@
                 <w:sz w:val="19"/>
                 <w:szCs w:val="19"/>
               </w:rPr>
+              <w:lastRenderedPageBreak/>
               <w:t>BD</w:t>
             </w:r>
             <w:r>
@@ -850,7 +1713,6 @@
             </w:tcMar>
           </w:tcPr>
           <w:p>
-            <w:proofErr w:type="gramStart"/>
             <w:r>
               <w:rPr>
                 <w:sz w:val="19"/>
@@ -863,15 +1725,7 @@
                 <w:sz w:val="19"/>
                 <w:szCs w:val="19"/>
               </w:rPr>
-              <w:t xml:space="preserve"> ,</w:t>
-            </w:r>
-            <w:proofErr w:type="gramEnd"/>
-            <w:r>
-              <w:rPr>
-                <w:sz w:val="19"/>
-                <w:szCs w:val="19"/>
-              </w:rPr>
-              <w:t xml:space="preserve"> checklist, </w:t>
+              <w:t xml:space="preserve"> , checklist, </w:t>
             </w:r>
           </w:p>
         </w:tc>
@@ -1695,8 +2549,363 @@
         <w:pStyle w:val="Heading1"/>
       </w:pPr>
       <w:r>
+        <w:t>3. Client setup for bookkeeping</w:t>
+      </w:r>
+    </w:p>
+    <w:p>
+      <w:pPr>
+        <w:spacing w:after="120"/>
+      </w:pPr>
+      <w:r>
+        <w:t>On top of the client profile fields in the main document, each bookkeeping client needs:</w:t>
+      </w:r>
+    </w:p>
+    <w:p>
+      <w:pPr>
+        <w:pStyle w:val="ListParagraph"/>
+        <w:numPr>
+          <w:ilvl w:val="0"/>
+          <w:numId w:val="2"/>
+        </w:numPr>
+        <w:spacing w:after="60"/>
+      </w:pPr>
+      <w:r>
+        <w:t>Country (US or Canada) and state or province. This sets the client's holiday calendar, time zone and reporting currency automatically</w:t>
+      </w:r>
+    </w:p>
+    <w:p>
+      <w:pPr>
+        <w:pStyle w:val="ListParagraph"/>
+        <w:numPr>
+          <w:ilvl w:val="0"/>
+          <w:numId w:val="2"/>
+        </w:numPr>
+        <w:spacing w:after="60"/>
+      </w:pPr>
+      <w:r>
+        <w:t>Service frequency: monthly, quarterly or catch-up/cleanup</w:t>
+      </w:r>
+    </w:p>
+    <w:p>
+      <w:pPr>
+        <w:pStyle w:val="ListParagraph"/>
+        <w:numPr>
+          <w:ilvl w:val="0"/>
+          <w:numId w:val="2"/>
+        </w:numPr>
+        <w:spacing w:after="60"/>
+      </w:pPr>
+      <w:r>
+        <w:t>Reporting tier: standard (financials by the 18th), priority (by BD10 – BD15, for lender or board clients), or quarterly (within 20 – 30 days of quarter-end)</w:t>
+      </w:r>
+    </w:p>
+    <w:p>
+      <w:pPr>
+        <w:pStyle w:val="ListParagraph"/>
+        <w:numPr>
+          <w:ilvl w:val="0"/>
+          <w:numId w:val="2"/>
+        </w:numPr>
+        <w:spacing w:after="60"/>
+      </w:pPr>
+      <w:r>
+        <w:t>Cash or accrual basis</w:t>
+      </w:r>
+    </w:p>
+    <w:p>
+      <w:pPr>
+        <w:pStyle w:val="ListParagraph"/>
+        <w:numPr>
+          <w:ilvl w:val="0"/>
+          <w:numId w:val="2"/>
+        </w:numPr>
+        <w:spacing w:after="60"/>
+      </w:pPr>
+      <w:r>
+        <w:t>List of all bank, credit card, loan and merchant accounts, and for each one whether it is on a bank feed or needs a statement from the client</w:t>
+      </w:r>
+    </w:p>
+    <w:p>
+      <w:pPr>
+        <w:pStyle w:val="ListParagraph"/>
+        <w:numPr>
+          <w:ilvl w:val="0"/>
+          <w:numId w:val="2"/>
+        </w:numPr>
+        <w:spacing w:after="60"/>
+      </w:pPr>
+      <w:r>
         <w:lastRenderedPageBreak/>
-        <w:t>3. Client setup for bookkeeping</w:t>
+        <w:t xml:space="preserve">Payroll provider (for example Gusto, </w:t>
+      </w:r>
+      <w:r>
+        <w:t>QBO</w:t>
+      </w:r>
+      <w:r>
+        <w:t>, Paychex, ) and whether we need reports from it</w:t>
+      </w:r>
+    </w:p>
+    <w:p>
+      <w:pPr>
+        <w:pStyle w:val="ListParagraph"/>
+        <w:numPr>
+          <w:ilvl w:val="0"/>
+          <w:numId w:val="2"/>
+        </w:numPr>
+        <w:spacing w:after="60"/>
+      </w:pPr>
+      <w:r>
+        <w:t>Whether the client has accounts in both USD and CAD, so foreign-currency accounts are included in the request list and reconciliations</w:t>
+      </w:r>
+    </w:p>
+    <w:p>
+      <w:pPr>
+        <w:pStyle w:val="ListParagraph"/>
+        <w:numPr>
+          <w:ilvl w:val="0"/>
+          <w:numId w:val="2"/>
+        </w:numPr>
+        <w:spacing w:after="60"/>
+      </w:pPr>
+      <w:r>
+        <w:t>Meeting frequency: monthly, quarterly or none</w:t>
+      </w:r>
+    </w:p>
+    <w:p>
+      <w:pPr>
+        <w:pStyle w:val="ListParagraph"/>
+        <w:numPr>
+          <w:ilvl w:val="0"/>
+          <w:numId w:val="2"/>
+        </w:numPr>
+        <w:spacing w:after="60"/>
+      </w:pPr>
+      <w:r>
+        <w:t>Client contacts for document requests vs. contacts who receive financials</w:t>
+      </w:r>
+    </w:p>
+    <w:p>
+      <w:pPr>
+        <w:pStyle w:val="ListParagraph"/>
+        <w:numPr>
+          <w:ilvl w:val="0"/>
+          <w:numId w:val="2"/>
+        </w:numPr>
+        <w:spacing w:after="60"/>
+      </w:pPr>
+      <w:r>
+        <w:t>Catch-up clients should stay on a separate project plan until the books are current, then switch to the monthly cycle with one click</w:t>
+      </w:r>
+    </w:p>
+    <w:p>
+      <w:pPr>
+        <w:pStyle w:val="Heading1"/>
+      </w:pPr>
+      <w:r>
+        <w:t>4. Document requests</w:t>
+      </w:r>
+    </w:p>
+    <w:p>
+      <w:pPr>
+        <w:pStyle w:val="ListParagraph"/>
+        <w:numPr>
+          <w:ilvl w:val="0"/>
+          <w:numId w:val="2"/>
+        </w:numPr>
+        <w:spacing w:after="60"/>
+      </w:pPr>
+      <w:r>
+        <w:t>Each month the portal builds the request list automatically from the client's account list, so staff are not typing the same request every month</w:t>
+      </w:r>
+    </w:p>
+    <w:p>
+      <w:pPr>
+        <w:pStyle w:val="ListParagraph"/>
+        <w:numPr>
+          <w:ilvl w:val="0"/>
+          <w:numId w:val="2"/>
+        </w:numPr>
+        <w:spacing w:after="60"/>
+      </w:pPr>
+      <w:r>
+        <w:t>If an account is on a QBO bank feed and the feed is up to date, the portal should leave that statement off the request (or mark it as "only if needed").</w:t>
+      </w:r>
+    </w:p>
+    <w:p>
+      <w:pPr>
+        <w:pStyle w:val="ListParagraph"/>
+        <w:numPr>
+          <w:ilvl w:val="0"/>
+          <w:numId w:val="2"/>
+        </w:numPr>
+        <w:spacing w:after="60"/>
+      </w:pPr>
+      <w:r>
+        <w:t>Typical items: bank and card statements, loan and lease statements, Stripe / PayPal / Shopify / Square reports, payroll register, receipts over the threshold, and a free-text box for anything unusual (new loans, asset purchases, owner draws).</w:t>
+      </w:r>
+    </w:p>
+    <w:p>
+      <w:pPr>
+        <w:pStyle w:val="ListParagraph"/>
+        <w:numPr>
+          <w:ilvl w:val="0"/>
+          <w:numId w:val="2"/>
+        </w:numPr>
+        <w:spacing w:after="60"/>
+      </w:pPr>
+      <w:r>
+        <w:t>The client uploads against each line item. Each item shows Requested, Received, or Not applicable, with the date received.</w:t>
+      </w:r>
+    </w:p>
+    <w:p>
+      <w:pPr>
+        <w:pStyle w:val="ListParagraph"/>
+        <w:numPr>
+          <w:ilvl w:val="0"/>
+          <w:numId w:val="2"/>
+        </w:numPr>
+        <w:spacing w:after="60"/>
+      </w:pPr>
+      <w:r>
+        <w:t xml:space="preserve">Staff can mark an item as received </w:t>
+      </w:r>
+      <w:r>
+        <w:t>or</w:t>
+      </w:r>
+      <w:r>
+        <w:t xml:space="preserve"> </w:t>
+      </w:r>
+      <w:r>
+        <w:t xml:space="preserve">request completed </w:t>
+      </w:r>
+      <w:r>
+        <w:t>if it came in by another route, and attach the file.</w:t>
+      </w:r>
+    </w:p>
+    <w:p>
+      <w:pPr>
+        <w:pStyle w:val="ListParagraph"/>
+        <w:numPr>
+          <w:ilvl w:val="0"/>
+          <w:numId w:val="2"/>
+        </w:numPr>
+        <w:spacing w:after="60"/>
+      </w:pPr>
+      <w:r>
+        <w:t>Reminders only list what is still missing, never the full list again.</w:t>
+      </w:r>
+    </w:p>
+    <w:p>
+      <w:pPr>
+        <w:pStyle w:val="ListParagraph"/>
+        <w:numPr>
+          <w:ilvl w:val="0"/>
+          <w:numId w:val="2"/>
+        </w:numPr>
+        <w:spacing w:after="60"/>
+      </w:pPr>
+      <w:r>
+        <w:t>We want to see, per client, how many days late documents usually arrive. This helps when we talk to clients about fees or timelines.</w:t>
+      </w:r>
+    </w:p>
+    <w:p>
+      <w:pPr>
+        <w:pStyle w:val="Heading1"/>
+      </w:pPr>
+      <w:r>
+        <w:t>5. Client questions</w:t>
+      </w:r>
+    </w:p>
+    <w:p>
+      <w:pPr>
+        <w:pStyle w:val="ListParagraph"/>
+        <w:numPr>
+          <w:ilvl w:val="0"/>
+          <w:numId w:val="2"/>
+        </w:numPr>
+        <w:spacing w:after="60"/>
+      </w:pPr>
+      <w:r>
+        <w:t>Staff can pull uncategorized and "Ask My Accountant" transactions straight from QBO into a question list (date, amount, payee).</w:t>
+      </w:r>
+    </w:p>
+    <w:p>
+      <w:pPr>
+        <w:pStyle w:val="ListParagraph"/>
+        <w:numPr>
+          <w:ilvl w:val="0"/>
+          <w:numId w:val="2"/>
+        </w:numPr>
+        <w:spacing w:after="60"/>
+      </w:pPr>
+      <w:r>
+        <w:t>Staff can also add their own questions manually.</w:t>
+      </w:r>
+    </w:p>
+    <w:p>
+      <w:pPr>
+        <w:pStyle w:val="ListParagraph"/>
+        <w:numPr>
+          <w:ilvl w:val="0"/>
+          <w:numId w:val="2"/>
+        </w:numPr>
+        <w:spacing w:after="60"/>
+      </w:pPr>
+      <w:r>
+        <w:t>The client answers each line in the portal: category, purpose, and an optional receipt upload. No long email threads.</w:t>
+      </w:r>
+    </w:p>
+    <w:p>
+      <w:pPr>
+        <w:pStyle w:val="ListParagraph"/>
+        <w:numPr>
+          <w:ilvl w:val="0"/>
+          <w:numId w:val="2"/>
+        </w:numPr>
+        <w:spacing w:after="60"/>
+      </w:pPr>
+      <w:r>
+        <w:t>Default reply window: 3 business days, with one automatic reminder.</w:t>
+      </w:r>
+    </w:p>
+    <w:p>
+      <w:pPr>
+        <w:pStyle w:val="ListParagraph"/>
+        <w:numPr>
+          <w:ilvl w:val="0"/>
+          <w:numId w:val="2"/>
+        </w:numPr>
+        <w:spacing w:after="60"/>
+      </w:pPr>
+      <w:r>
+        <w:t>Questions still open at the time of release are listed automatically in the financials package as open items.</w:t>
+      </w:r>
+    </w:p>
+    <w:p>
+      <w:pPr>
+        <w:pStyle w:val="ListParagraph"/>
+        <w:numPr>
+          <w:ilvl w:val="0"/>
+          <w:numId w:val="2"/>
+        </w:numPr>
+        <w:spacing w:after="60"/>
+      </w:pPr>
+      <w:r>
+        <w:t xml:space="preserve">A setting for the maximum uncategorized amount allowed before financials can be released (default: under </w:t>
+      </w:r>
+      <w:r>
+        <w:t>5</w:t>
+      </w:r>
+      <w:r>
+        <w:t>% of the month's activity). If it is above that, the reviewer has to approve the exception and add a note.</w:t>
+      </w:r>
+    </w:p>
+    <w:p>
+      <w:pPr>
+        <w:pStyle w:val="Heading1"/>
+      </w:pPr>
+      <w:r>
+        <w:t>6. Month-end close checklist</w:t>
       </w:r>
     </w:p>
     <w:p>
@@ -1704,143 +2913,175 @@
         <w:spacing w:after="120"/>
       </w:pPr>
       <w:r>
-        <w:t>On top of the client profile fields in the main document, each bookkeeping client needs:</w:t>
-      </w:r>
-    </w:p>
-    <w:p>
-      <w:pPr>
-        <w:pStyle w:val="ListParagraph"/>
-        <w:numPr>
-          <w:ilvl w:val="0"/>
-          <w:numId w:val="2"/>
-        </w:numPr>
-        <w:spacing w:after="60"/>
-      </w:pPr>
-      <w:r>
-        <w:t>Country (US or Canada) and state or province. This sets the client's holiday calendar, time zone and reporting currency automatically</w:t>
-      </w:r>
-    </w:p>
-    <w:p>
-      <w:pPr>
-        <w:pStyle w:val="ListParagraph"/>
-        <w:numPr>
-          <w:ilvl w:val="0"/>
-          <w:numId w:val="2"/>
-        </w:numPr>
-        <w:spacing w:after="60"/>
-      </w:pPr>
-      <w:r>
-        <w:t>Service frequency: monthly, quarterly or catch-up/cleanup</w:t>
-      </w:r>
-    </w:p>
-    <w:p>
-      <w:pPr>
-        <w:pStyle w:val="ListParagraph"/>
-        <w:numPr>
-          <w:ilvl w:val="0"/>
-          <w:numId w:val="2"/>
-        </w:numPr>
-        <w:spacing w:after="60"/>
-      </w:pPr>
-      <w:r>
-        <w:t>Reporting tier: standard (financials by the 18th), priority (by BD10 – BD15, for lender or board clients), or quarterly (within 20 – 30 days of quarter-end)</w:t>
-      </w:r>
-    </w:p>
-    <w:p>
-      <w:pPr>
-        <w:pStyle w:val="ListParagraph"/>
-        <w:numPr>
-          <w:ilvl w:val="0"/>
-          <w:numId w:val="2"/>
-        </w:numPr>
-        <w:spacing w:after="60"/>
-      </w:pPr>
-      <w:r>
-        <w:t>Cash or accrual basis</w:t>
-      </w:r>
-    </w:p>
-    <w:p>
-      <w:pPr>
-        <w:pStyle w:val="ListParagraph"/>
-        <w:numPr>
-          <w:ilvl w:val="0"/>
-          <w:numId w:val="2"/>
-        </w:numPr>
-        <w:spacing w:after="60"/>
-      </w:pPr>
-      <w:r>
-        <w:t>List of all bank, credit card, loan and merchant accounts, and for each one whether it is on a bank feed or needs a statement from the client</w:t>
-      </w:r>
-    </w:p>
-    <w:p>
-      <w:pPr>
-        <w:pStyle w:val="ListParagraph"/>
-        <w:numPr>
-          <w:ilvl w:val="0"/>
-          <w:numId w:val="2"/>
-        </w:numPr>
-        <w:spacing w:after="60"/>
-      </w:pPr>
-      <w:r>
-        <w:t xml:space="preserve">Payroll provider (for example Gusto, </w:t>
-      </w:r>
-      <w:r>
-        <w:t>QBO</w:t>
-      </w:r>
-      <w:r>
-        <w:t>, Paychex, ) and whether we need reports from it</w:t>
-      </w:r>
-    </w:p>
-    <w:p>
-      <w:pPr>
-        <w:pStyle w:val="ListParagraph"/>
-        <w:numPr>
-          <w:ilvl w:val="0"/>
-          <w:numId w:val="2"/>
-        </w:numPr>
-        <w:spacing w:after="60"/>
-      </w:pPr>
-      <w:r>
-        <w:t>Whether the client has accounts in both USD and CAD, so foreign-currency accounts are included in the request list and reconciliations</w:t>
-      </w:r>
-    </w:p>
-    <w:p>
-      <w:pPr>
-        <w:pStyle w:val="ListParagraph"/>
-        <w:numPr>
-          <w:ilvl w:val="0"/>
-          <w:numId w:val="2"/>
-        </w:numPr>
-        <w:spacing w:after="60"/>
-      </w:pPr>
-      <w:r>
-        <w:t>Meeting frequency: monthly, quarterly or none</w:t>
-      </w:r>
-    </w:p>
-    <w:p>
-      <w:pPr>
-        <w:pStyle w:val="ListParagraph"/>
-        <w:numPr>
-          <w:ilvl w:val="0"/>
-          <w:numId w:val="2"/>
-        </w:numPr>
-        <w:spacing w:after="60"/>
-      </w:pPr>
-      <w:r>
-        <w:t>Client contacts for document requests vs. contacts who receive financials</w:t>
-      </w:r>
-    </w:p>
-    <w:p>
-      <w:pPr>
-        <w:pStyle w:val="ListParagraph"/>
-        <w:numPr>
-          <w:ilvl w:val="0"/>
-          <w:numId w:val="2"/>
-        </w:numPr>
-        <w:spacing w:after="60"/>
-      </w:pPr>
-      <w:r>
-        <w:t>Catch-up clients should stay on a separate project plan until the books are current, then switch to the monthly cycle with one click</w:t>
+        <w:t>Every monthly close should create a checklist from a template we control. Default checklist:</w:t>
+      </w:r>
+    </w:p>
+    <w:p>
+      <w:pPr>
+        <w:pStyle w:val="ListParagraph"/>
+        <w:numPr>
+          <w:ilvl w:val="0"/>
+          <w:numId w:val="2"/>
+        </w:numPr>
+        <w:spacing w:after="60"/>
+      </w:pPr>
+      <w:r>
+        <w:t>All bank, credit card and loan accounts reconciled to the statement balance (pulled from QBO where possible)</w:t>
+      </w:r>
+    </w:p>
+    <w:p>
+      <w:pPr>
+        <w:pStyle w:val="ListParagraph"/>
+        <w:numPr>
+          <w:ilvl w:val="0"/>
+          <w:numId w:val="2"/>
+        </w:numPr>
+        <w:spacing w:after="60"/>
+      </w:pPr>
+      <w:r>
+        <w:lastRenderedPageBreak/>
+        <w:t>Merchant and payment platform payouts matched to deposits</w:t>
+      </w:r>
+    </w:p>
+    <w:p>
+      <w:pPr>
+        <w:pStyle w:val="ListParagraph"/>
+        <w:numPr>
+          <w:ilvl w:val="0"/>
+          <w:numId w:val="2"/>
+        </w:numPr>
+        <w:spacing w:after="60"/>
+      </w:pPr>
+      <w:r>
+        <w:t>Payroll entries posted and payroll liabilities tied to the payroll report</w:t>
+      </w:r>
+    </w:p>
+    <w:p>
+      <w:pPr>
+        <w:pStyle w:val="ListParagraph"/>
+        <w:numPr>
+          <w:ilvl w:val="0"/>
+          <w:numId w:val="2"/>
+        </w:numPr>
+        <w:spacing w:after="60"/>
+      </w:pPr>
+      <w:r>
+        <w:t>AP and AR reviewed; aging reports make sense</w:t>
+      </w:r>
+    </w:p>
+    <w:p>
+      <w:pPr>
+        <w:pStyle w:val="ListParagraph"/>
+        <w:numPr>
+          <w:ilvl w:val="0"/>
+          <w:numId w:val="2"/>
+        </w:numPr>
+        <w:spacing w:after="60"/>
+      </w:pPr>
+      <w:r>
+        <w:t>Accruals and prepaids posted (accrual-basis clients only)</w:t>
+      </w:r>
+    </w:p>
+    <w:p>
+      <w:pPr>
+        <w:pStyle w:val="ListParagraph"/>
+        <w:numPr>
+          <w:ilvl w:val="0"/>
+          <w:numId w:val="2"/>
+        </w:numPr>
+        <w:spacing w:after="60"/>
+      </w:pPr>
+      <w:r>
+        <w:t>Loan balances tied to lender statements</w:t>
+      </w:r>
+    </w:p>
+    <w:p>
+      <w:pPr>
+        <w:pStyle w:val="ListParagraph"/>
+        <w:numPr>
+          <w:ilvl w:val="0"/>
+          <w:numId w:val="2"/>
+        </w:numPr>
+        <w:spacing w:after="60"/>
+      </w:pPr>
+      <w:r>
+        <w:t>Uncategorized and suspense balances cleared or explained</w:t>
+      </w:r>
+    </w:p>
+    <w:p>
+      <w:pPr>
+        <w:pStyle w:val="ListParagraph"/>
+        <w:numPr>
+          <w:ilvl w:val="0"/>
+          <w:numId w:val="2"/>
+        </w:numPr>
+        <w:spacing w:after="60"/>
+      </w:pPr>
+      <w:r>
+        <w:t>Prior-period balances unchanged since last close</w:t>
+      </w:r>
+    </w:p>
+    <w:p>
+      <w:pPr>
+        <w:pStyle w:val="ListParagraph"/>
+        <w:numPr>
+          <w:ilvl w:val="0"/>
+          <w:numId w:val="2"/>
+        </w:numPr>
+        <w:spacing w:after="60"/>
+      </w:pPr>
+      <w:r>
+        <w:t>Closing date set in QBO</w:t>
+      </w:r>
+    </w:p>
+    <w:p>
+      <w:pPr>
+        <w:spacing w:after="120"/>
+      </w:pPr>
+      <w:r>
+        <w:t>Rules around the checklist:</w:t>
+      </w:r>
+    </w:p>
+    <w:p>
+      <w:pPr>
+        <w:pStyle w:val="ListParagraph"/>
+        <w:numPr>
+          <w:ilvl w:val="0"/>
+          <w:numId w:val="2"/>
+        </w:numPr>
+        <w:spacing w:after="60"/>
+      </w:pPr>
+      <w:r>
+        <w:t>The close cannot be marked done until every item is ticked or marked not applicable with a reason.</w:t>
+      </w:r>
+    </w:p>
+    <w:p>
+      <w:pPr>
+        <w:pStyle w:val="ListParagraph"/>
+        <w:numPr>
+          <w:ilvl w:val="0"/>
+          <w:numId w:val="2"/>
+        </w:numPr>
+        <w:spacing w:after="60"/>
+      </w:pPr>
+      <w:r>
+        <w:t>A reviewer has to sign off before the financials can be released. The preparer cannot be the reviewer</w:t>
+      </w:r>
+      <w:r>
+        <w:t>.</w:t>
+      </w:r>
+    </w:p>
+    <w:p>
+      <w:pPr>
+        <w:pStyle w:val="ListParagraph"/>
+        <w:numPr>
+          <w:ilvl w:val="0"/>
+          <w:numId w:val="2"/>
+        </w:numPr>
+        <w:spacing w:after="60"/>
+      </w:pPr>
+      <w:r>
+        <w:t>Where QBO data can confirm an item (reconciled-through date, uncategorized balance, closing date), the portal should check it automatically rather than relying on the tick box.</w:t>
       </w:r>
     </w:p>
     <w:p>
@@ -1848,109 +3089,72 @@
         <w:pStyle w:val="Heading1"/>
       </w:pPr>
       <w:r>
-        <w:t>4. Document requests</w:t>
-      </w:r>
-    </w:p>
-    <w:p>
-      <w:pPr>
-        <w:pStyle w:val="ListParagraph"/>
-        <w:numPr>
-          <w:ilvl w:val="0"/>
-          <w:numId w:val="2"/>
-        </w:numPr>
-        <w:spacing w:after="60"/>
-      </w:pPr>
-      <w:r>
-        <w:t>Each month the portal builds the request list automatically from the client's account list, so staff are not typing the same request every month</w:t>
-      </w:r>
-    </w:p>
-    <w:p>
-      <w:pPr>
-        <w:pStyle w:val="ListParagraph"/>
-        <w:numPr>
-          <w:ilvl w:val="0"/>
-          <w:numId w:val="2"/>
-        </w:numPr>
-        <w:spacing w:after="60"/>
-      </w:pPr>
-      <w:r>
-        <w:t>If an account is on a QBO bank feed and the feed is up to date, the portal should leave that statement off the request (or mark it as "only if needed").</w:t>
-      </w:r>
-    </w:p>
-    <w:p>
-      <w:pPr>
-        <w:pStyle w:val="ListParagraph"/>
-        <w:numPr>
-          <w:ilvl w:val="0"/>
-          <w:numId w:val="2"/>
-        </w:numPr>
-        <w:spacing w:after="60"/>
-      </w:pPr>
-      <w:r>
-        <w:t>Typical items: bank and card statements, loan and lease statements, Stripe / PayPal / Shopify / Square reports, payroll register, receipts over the threshold, and a free-text box for anything unusual (new loans, asset purchases, owner draws).</w:t>
-      </w:r>
-    </w:p>
-    <w:p>
-      <w:pPr>
-        <w:pStyle w:val="ListParagraph"/>
-        <w:numPr>
-          <w:ilvl w:val="0"/>
-          <w:numId w:val="2"/>
-        </w:numPr>
-        <w:spacing w:after="60"/>
-      </w:pPr>
-      <w:r>
-        <w:t>The client uploads against each line item. Each item shows Requested, Received, or Not applicable, with the date received.</w:t>
-      </w:r>
-    </w:p>
-    <w:p>
-      <w:pPr>
-        <w:pStyle w:val="ListParagraph"/>
-        <w:numPr>
-          <w:ilvl w:val="0"/>
-          <w:numId w:val="2"/>
-        </w:numPr>
-        <w:spacing w:after="60"/>
-      </w:pPr>
-      <w:r>
-        <w:t xml:space="preserve">Staff can mark an item as received </w:t>
-      </w:r>
-      <w:proofErr w:type="spellStart"/>
-      <w:r>
-        <w:t>orrequest</w:t>
-      </w:r>
-      <w:proofErr w:type="spellEnd"/>
-      <w:r>
-        <w:t xml:space="preserve"> completed </w:t>
-      </w:r>
-      <w:r>
-        <w:t>if it came in by another route, and attach the file.</w:t>
-      </w:r>
-    </w:p>
-    <w:p>
-      <w:pPr>
-        <w:pStyle w:val="ListParagraph"/>
-        <w:numPr>
-          <w:ilvl w:val="0"/>
-          <w:numId w:val="2"/>
-        </w:numPr>
-        <w:spacing w:after="60"/>
-      </w:pPr>
-      <w:r>
-        <w:t>Reminders only list what is still missing, never the full list again.</w:t>
-      </w:r>
-    </w:p>
-    <w:p>
-      <w:pPr>
-        <w:pStyle w:val="ListParagraph"/>
-        <w:numPr>
-          <w:ilvl w:val="0"/>
-          <w:numId w:val="2"/>
-        </w:numPr>
-        <w:spacing w:after="60"/>
-      </w:pPr>
-      <w:r>
-        <w:t>We want to see, per client, how many days late documents usually arrive. This helps when we talk to clients about fees or timelines.</w:t>
+        <w:t>7. Financials package and delivery</w:t>
+      </w:r>
+    </w:p>
+    <w:p>
+      <w:pPr>
+        <w:pStyle w:val="ListParagraph"/>
+        <w:numPr>
+          <w:ilvl w:val="0"/>
+          <w:numId w:val="2"/>
+        </w:numPr>
+        <w:spacing w:after="60"/>
+      </w:pPr>
+      <w:r>
+        <w:t>Standard package, generated from QBO where possible: P&amp;L (month and year to date with a comparison column), Balance Sheet, AR and AP aging, a cash summary, and bank reconciliation reports.</w:t>
+      </w:r>
+    </w:p>
+    <w:p>
+      <w:pPr>
+        <w:pStyle w:val="ListParagraph"/>
+        <w:numPr>
+          <w:ilvl w:val="0"/>
+          <w:numId w:val="2"/>
+        </w:numPr>
+        <w:spacing w:after="60"/>
+      </w:pPr>
+      <w:r>
+        <w:t>A commentary box where staff write a few lines in plain English: what changed, cash position, anything the owner should act on, and what we are still waiting for from them.</w:t>
+      </w:r>
+    </w:p>
+    <w:p>
+      <w:pPr>
+        <w:pStyle w:val="ListParagraph"/>
+        <w:numPr>
+          <w:ilvl w:val="0"/>
+          <w:numId w:val="2"/>
+        </w:numPr>
+        <w:spacing w:after="60"/>
+      </w:pPr>
+      <w:r>
+        <w:t>The package goes to the reviewer first, then is released to the client's portal with a "financials are ready" email from our template.</w:t>
+      </w:r>
+    </w:p>
+    <w:p>
+      <w:pPr>
+        <w:pStyle w:val="ListParagraph"/>
+        <w:numPr>
+          <w:ilvl w:val="0"/>
+          <w:numId w:val="2"/>
+        </w:numPr>
+        <w:spacing w:after="60"/>
+      </w:pPr>
+      <w:r>
+        <w:t>The portal records the release date and whether the client opened or downloaded it.</w:t>
+      </w:r>
+    </w:p>
+    <w:p>
+      <w:pPr>
+        <w:pStyle w:val="ListParagraph"/>
+        <w:numPr>
+          <w:ilvl w:val="0"/>
+          <w:numId w:val="2"/>
+        </w:numPr>
+        <w:spacing w:after="60"/>
+      </w:pPr>
+      <w:r>
+        <w:t>Default deadlines by tier: standard by the 18th (hard limit 20th), priority by BD10 – BD15, quarterly within 20 – 30 days of quarter-end. Year-end books finalized within 30 – 60 days of year-end.</w:t>
       </w:r>
     </w:p>
     <w:p>
@@ -1958,432 +3162,83 @@
         <w:pStyle w:val="Heading1"/>
       </w:pPr>
       <w:r>
-        <w:t>5. Client questions</w:t>
-      </w:r>
-    </w:p>
-    <w:p>
-      <w:pPr>
-        <w:pStyle w:val="ListParagraph"/>
-        <w:numPr>
-          <w:ilvl w:val="0"/>
-          <w:numId w:val="2"/>
-        </w:numPr>
-        <w:spacing w:after="60"/>
-      </w:pPr>
-      <w:r>
-        <w:t>Staff can pull uncategorized and "Ask My Accountant" transactions straight from QBO into a question list (date, amount, payee).</w:t>
-      </w:r>
-    </w:p>
-    <w:p>
-      <w:pPr>
-        <w:pStyle w:val="ListParagraph"/>
-        <w:numPr>
-          <w:ilvl w:val="0"/>
-          <w:numId w:val="2"/>
-        </w:numPr>
-        <w:spacing w:after="60"/>
-      </w:pPr>
-      <w:r>
-        <w:t>Staff can also add their own questions manually.</w:t>
-      </w:r>
-    </w:p>
-    <w:p>
-      <w:pPr>
-        <w:pStyle w:val="ListParagraph"/>
-        <w:numPr>
-          <w:ilvl w:val="0"/>
-          <w:numId w:val="2"/>
-        </w:numPr>
-        <w:spacing w:after="60"/>
-      </w:pPr>
-      <w:r>
-        <w:t>The client answers each line in the portal: category, purpose, and an optional receipt upload. No long email threads.</w:t>
-      </w:r>
-    </w:p>
-    <w:p>
-      <w:pPr>
-        <w:pStyle w:val="ListParagraph"/>
-        <w:numPr>
-          <w:ilvl w:val="0"/>
-          <w:numId w:val="2"/>
-        </w:numPr>
-        <w:spacing w:after="60"/>
-      </w:pPr>
-      <w:r>
-        <w:t>Default reply window: 3 business days, with one automatic reminder.</w:t>
-      </w:r>
-    </w:p>
-    <w:p>
-      <w:pPr>
-        <w:pStyle w:val="ListParagraph"/>
-        <w:numPr>
-          <w:ilvl w:val="0"/>
-          <w:numId w:val="2"/>
-        </w:numPr>
-        <w:spacing w:after="60"/>
+        <w:t>8. Client review meetings</w:t>
+      </w:r>
+    </w:p>
+    <w:p>
+      <w:pPr>
+        <w:pStyle w:val="ListParagraph"/>
+        <w:numPr>
+          <w:ilvl w:val="0"/>
+          <w:numId w:val="2"/>
+        </w:numPr>
+        <w:spacing w:after="60"/>
+      </w:pPr>
+      <w:r>
+        <w:t>Meeting frequency comes from the client profile (monthly, quarterly, annual year-end review, or none).</w:t>
+      </w:r>
+    </w:p>
+    <w:p>
+      <w:pPr>
+        <w:pStyle w:val="ListParagraph"/>
+        <w:numPr>
+          <w:ilvl w:val="0"/>
+          <w:numId w:val="2"/>
+        </w:numPr>
+        <w:spacing w:after="60"/>
+      </w:pPr>
+      <w:r>
+        <w:t>The portal schedules or reminds us to schedule the meeting for the window between the 20th and month-end.</w:t>
+      </w:r>
+    </w:p>
+    <w:p>
+      <w:pPr>
+        <w:pStyle w:val="ListParagraph"/>
+        <w:numPr>
+          <w:ilvl w:val="0"/>
+          <w:numId w:val="2"/>
+        </w:numPr>
+        <w:spacing w:after="60"/>
+      </w:pPr>
+      <w:r>
+        <w:t>Two business days before the meeting, it emails the client the agenda, the financials link and the open question list.</w:t>
+      </w:r>
+    </w:p>
+    <w:p>
+      <w:pPr>
+        <w:pStyle w:val="ListParagraph"/>
+        <w:numPr>
+          <w:ilvl w:val="0"/>
+          <w:numId w:val="2"/>
+        </w:numPr>
+        <w:spacing w:after="60"/>
+      </w:pPr>
+      <w:r>
+        <w:t>After the meeting, staff record a short recap. Action items from the recap turn into tasks with owners and due dates, and the recap is emailed to the client the same day</w:t>
+      </w:r>
+      <w:r>
+        <w:t xml:space="preserve"> (like MoM)</w:t>
+      </w:r>
+    </w:p>
+    <w:p>
+      <w:pPr>
+        <w:pStyle w:val="ListParagraph"/>
+        <w:numPr>
+          <w:ilvl w:val="0"/>
+          <w:numId w:val="2"/>
+        </w:numPr>
+        <w:spacing w:after="60"/>
+      </w:pPr>
+      <w:r>
+        <w:t>Times are shown in both the client's time zone and Pakistan time, since meetings need to fall in our evening overlap hours.</w:t>
+      </w:r>
+    </w:p>
+    <w:p>
+      <w:pPr>
+        <w:pStyle w:val="Heading1"/>
       </w:pPr>
       <w:r>
         <w:lastRenderedPageBreak/>
-        <w:t>Questions still open at the time of release are listed automatically in the financials package as open items.</w:t>
-      </w:r>
-    </w:p>
-    <w:p>
-      <w:pPr>
-        <w:pStyle w:val="ListParagraph"/>
-        <w:numPr>
-          <w:ilvl w:val="0"/>
-          <w:numId w:val="2"/>
-        </w:numPr>
-        <w:spacing w:after="60"/>
-      </w:pPr>
-      <w:r>
-        <w:t xml:space="preserve">A setting for the maximum uncategorized amount allowed before financials can be released (default: under </w:t>
-      </w:r>
-      <w:r>
-        <w:t>5</w:t>
-      </w:r>
-      <w:r>
-        <w:t>% of the month's activity). If it is above that, the reviewer has to approve the exception and add a note.</w:t>
-      </w:r>
-    </w:p>
-    <w:p>
-      <w:pPr>
-        <w:pStyle w:val="Heading1"/>
-      </w:pPr>
-      <w:r>
-        <w:t>6. Month-end close checklist</w:t>
-      </w:r>
-    </w:p>
-    <w:p>
-      <w:pPr>
-        <w:spacing w:after="120"/>
-      </w:pPr>
-      <w:r>
-        <w:t>Every monthly close should create a checklist from a template we control. Default checklist:</w:t>
-      </w:r>
-    </w:p>
-    <w:p>
-      <w:pPr>
-        <w:pStyle w:val="ListParagraph"/>
-        <w:numPr>
-          <w:ilvl w:val="0"/>
-          <w:numId w:val="2"/>
-        </w:numPr>
-        <w:spacing w:after="60"/>
-      </w:pPr>
-      <w:r>
-        <w:t>All bank, credit card and loan accounts reconciled to the statement balance (pulled from QBO where possible)</w:t>
-      </w:r>
-    </w:p>
-    <w:p>
-      <w:pPr>
-        <w:pStyle w:val="ListParagraph"/>
-        <w:numPr>
-          <w:ilvl w:val="0"/>
-          <w:numId w:val="2"/>
-        </w:numPr>
-        <w:spacing w:after="60"/>
-      </w:pPr>
-      <w:r>
-        <w:t>Merchant and payment platform payouts matched to deposits</w:t>
-      </w:r>
-    </w:p>
-    <w:p>
-      <w:pPr>
-        <w:pStyle w:val="ListParagraph"/>
-        <w:numPr>
-          <w:ilvl w:val="0"/>
-          <w:numId w:val="2"/>
-        </w:numPr>
-        <w:spacing w:after="60"/>
-      </w:pPr>
-      <w:r>
-        <w:t>Payroll entries posted and payroll liabilities tied to the payroll report</w:t>
-      </w:r>
-    </w:p>
-    <w:p>
-      <w:pPr>
-        <w:pStyle w:val="ListParagraph"/>
-        <w:numPr>
-          <w:ilvl w:val="0"/>
-          <w:numId w:val="2"/>
-        </w:numPr>
-        <w:spacing w:after="60"/>
-      </w:pPr>
-      <w:r>
-        <w:t>AP and AR reviewed; aging reports make sense</w:t>
-      </w:r>
-    </w:p>
-    <w:p>
-      <w:pPr>
-        <w:pStyle w:val="ListParagraph"/>
-        <w:numPr>
-          <w:ilvl w:val="0"/>
-          <w:numId w:val="2"/>
-        </w:numPr>
-        <w:spacing w:after="60"/>
-      </w:pPr>
-      <w:r>
-        <w:t>Accruals and prepaids posted (accrual-basis clients only)</w:t>
-      </w:r>
-    </w:p>
-    <w:p>
-      <w:pPr>
-        <w:pStyle w:val="ListParagraph"/>
-        <w:numPr>
-          <w:ilvl w:val="0"/>
-          <w:numId w:val="2"/>
-        </w:numPr>
-        <w:spacing w:after="60"/>
-      </w:pPr>
-      <w:r>
-        <w:t>Loan balances tied to lender statements</w:t>
-      </w:r>
-    </w:p>
-    <w:p>
-      <w:pPr>
-        <w:pStyle w:val="ListParagraph"/>
-        <w:numPr>
-          <w:ilvl w:val="0"/>
-          <w:numId w:val="2"/>
-        </w:numPr>
-        <w:spacing w:after="60"/>
-      </w:pPr>
-      <w:r>
-        <w:t>Uncategorized and suspense balances cleared or explained</w:t>
-      </w:r>
-    </w:p>
-    <w:p>
-      <w:pPr>
-        <w:pStyle w:val="ListParagraph"/>
-        <w:numPr>
-          <w:ilvl w:val="0"/>
-          <w:numId w:val="2"/>
-        </w:numPr>
-        <w:spacing w:after="60"/>
-      </w:pPr>
-      <w:r>
-        <w:t>Prior-period balances unchanged since last close</w:t>
-      </w:r>
-    </w:p>
-    <w:p>
-      <w:pPr>
-        <w:pStyle w:val="ListParagraph"/>
-        <w:numPr>
-          <w:ilvl w:val="0"/>
-          <w:numId w:val="2"/>
-        </w:numPr>
-        <w:spacing w:after="60"/>
-      </w:pPr>
-      <w:r>
-        <w:t>Closing date set in QBO</w:t>
-      </w:r>
-    </w:p>
-    <w:p>
-      <w:pPr>
-        <w:spacing w:after="120"/>
-      </w:pPr>
-      <w:r>
-        <w:t>Rules around the checklist:</w:t>
-      </w:r>
-    </w:p>
-    <w:p>
-      <w:pPr>
-        <w:pStyle w:val="ListParagraph"/>
-        <w:numPr>
-          <w:ilvl w:val="0"/>
-          <w:numId w:val="2"/>
-        </w:numPr>
-        <w:spacing w:after="60"/>
-      </w:pPr>
-      <w:r>
-        <w:t>The close cannot be marked done until every item is ticked or marked not applicable with a reason.</w:t>
-      </w:r>
-    </w:p>
-    <w:p>
-      <w:pPr>
-        <w:pStyle w:val="ListParagraph"/>
-        <w:numPr>
-          <w:ilvl w:val="0"/>
-          <w:numId w:val="2"/>
-        </w:numPr>
-        <w:spacing w:after="60"/>
-      </w:pPr>
-      <w:r>
-        <w:t>A reviewer has to sign off before the financials can be released. The preparer cannot be the reviewer</w:t>
-      </w:r>
-      <w:r>
-        <w:t>.</w:t>
-      </w:r>
-    </w:p>
-    <w:p>
-      <w:pPr>
-        <w:pStyle w:val="ListParagraph"/>
-        <w:numPr>
-          <w:ilvl w:val="0"/>
-          <w:numId w:val="2"/>
-        </w:numPr>
-        <w:spacing w:after="60"/>
-      </w:pPr>
-      <w:r>
-        <w:t>Where QBO data can confirm an item (reconciled-through date, uncategorized balance, closing date), the portal should check it automatically rather than relying on the tick box.</w:t>
-      </w:r>
-    </w:p>
-    <w:p>
-      <w:pPr>
-        <w:pStyle w:val="Heading1"/>
-      </w:pPr>
-      <w:r>
-        <w:t>7. Financials package and delivery</w:t>
-      </w:r>
-    </w:p>
-    <w:p>
-      <w:pPr>
-        <w:pStyle w:val="ListParagraph"/>
-        <w:numPr>
-          <w:ilvl w:val="0"/>
-          <w:numId w:val="2"/>
-        </w:numPr>
-        <w:spacing w:after="60"/>
-      </w:pPr>
-      <w:r>
-        <w:t>Standard package, generated from QBO where possible: P&amp;L (month and year to date with a comparison column), Balance Sheet, AR and AP aging, a cash summary, and bank reconciliation reports.</w:t>
-      </w:r>
-    </w:p>
-    <w:p>
-      <w:pPr>
-        <w:pStyle w:val="ListParagraph"/>
-        <w:numPr>
-          <w:ilvl w:val="0"/>
-          <w:numId w:val="2"/>
-        </w:numPr>
-        <w:spacing w:after="60"/>
-      </w:pPr>
-      <w:r>
-        <w:t>A commentary box where staff write a few lines in plain English: what changed, cash position, anything the owner should act on, and what we are still waiting for from them.</w:t>
-      </w:r>
-    </w:p>
-    <w:p>
-      <w:pPr>
-        <w:pStyle w:val="ListParagraph"/>
-        <w:numPr>
-          <w:ilvl w:val="0"/>
-          <w:numId w:val="2"/>
-        </w:numPr>
-        <w:spacing w:after="60"/>
-      </w:pPr>
-      <w:r>
-        <w:t>The package goes to the reviewer first, then is released to the client's portal with a "financials are ready" email from our template.</w:t>
-      </w:r>
-    </w:p>
-    <w:p>
-      <w:pPr>
-        <w:pStyle w:val="ListParagraph"/>
-        <w:numPr>
-          <w:ilvl w:val="0"/>
-          <w:numId w:val="2"/>
-        </w:numPr>
-        <w:spacing w:after="60"/>
-      </w:pPr>
-      <w:r>
-        <w:t>The portal records the release date and whether the client opened or downloaded it.</w:t>
-      </w:r>
-    </w:p>
-    <w:p>
-      <w:pPr>
-        <w:pStyle w:val="ListParagraph"/>
-        <w:numPr>
-          <w:ilvl w:val="0"/>
-          <w:numId w:val="2"/>
-        </w:numPr>
-        <w:spacing w:after="60"/>
-      </w:pPr>
-      <w:r>
-        <w:t>Default deadlines by tier: standard by the 18th (hard limit 20th), priority by BD10 – BD15, quarterly within 20 – 30 days of quarter-end. Year-end books finalized within 30 – 60 days of year-end.</w:t>
-      </w:r>
-    </w:p>
-    <w:p>
-      <w:pPr>
-        <w:pStyle w:val="Heading1"/>
-      </w:pPr>
-      <w:r>
-        <w:t>8. Client review meetings</w:t>
-      </w:r>
-    </w:p>
-    <w:p>
-      <w:pPr>
-        <w:pStyle w:val="ListParagraph"/>
-        <w:numPr>
-          <w:ilvl w:val="0"/>
-          <w:numId w:val="2"/>
-        </w:numPr>
-        <w:spacing w:after="60"/>
-      </w:pPr>
-      <w:r>
-        <w:lastRenderedPageBreak/>
-        <w:t>Meeting frequency comes from the client profile (monthly, quarterly, annual year-end review, or none).</w:t>
-      </w:r>
-    </w:p>
-    <w:p>
-      <w:pPr>
-        <w:pStyle w:val="ListParagraph"/>
-        <w:numPr>
-          <w:ilvl w:val="0"/>
-          <w:numId w:val="2"/>
-        </w:numPr>
-        <w:spacing w:after="60"/>
-      </w:pPr>
-      <w:r>
-        <w:t>The portal schedules or reminds us to schedule the meeting for the window between the 20th and month-end.</w:t>
-      </w:r>
-    </w:p>
-    <w:p>
-      <w:pPr>
-        <w:pStyle w:val="ListParagraph"/>
-        <w:numPr>
-          <w:ilvl w:val="0"/>
-          <w:numId w:val="2"/>
-        </w:numPr>
-        <w:spacing w:after="60"/>
-      </w:pPr>
-      <w:r>
-        <w:t>Two business days before the meeting, it emails the client the agenda, the financials link and the open question list.</w:t>
-      </w:r>
-    </w:p>
-    <w:p>
-      <w:pPr>
-        <w:pStyle w:val="ListParagraph"/>
-        <w:numPr>
-          <w:ilvl w:val="0"/>
-          <w:numId w:val="2"/>
-        </w:numPr>
-        <w:spacing w:after="60"/>
-      </w:pPr>
-      <w:r>
-        <w:t>After the meeting, staff record a short recap. Action items from the recap turn into tasks with owners and due dates, and the recap is emailed to the client the same day</w:t>
-      </w:r>
-      <w:r>
-        <w:t xml:space="preserve"> (like MoM)</w:t>
-      </w:r>
-    </w:p>
-    <w:p>
-      <w:pPr>
-        <w:pStyle w:val="ListParagraph"/>
-        <w:numPr>
-          <w:ilvl w:val="0"/>
-          <w:numId w:val="2"/>
-        </w:numPr>
-        <w:spacing w:after="60"/>
-      </w:pPr>
-      <w:r>
-        <w:t>Times are shown in both the client's time zone and Pakistan time, since meetings need to fall in our evening overlap hours.</w:t>
-      </w:r>
-    </w:p>
-    <w:p>
-      <w:pPr>
-        <w:pStyle w:val="Heading1"/>
-      </w:pPr>
-      <w:r>
         <w:t>9. Response times</w:t>
       </w:r>
     </w:p>
@@ -3335,7 +4190,6 @@
                 <w:sz w:val="19"/>
                 <w:szCs w:val="19"/>
               </w:rPr>
-              <w:lastRenderedPageBreak/>
               <w:t>10</w:t>
             </w:r>
           </w:p>
@@ -3754,6 +4608,7 @@
                 <w:sz w:val="19"/>
                 <w:szCs w:val="19"/>
               </w:rPr>
+              <w:lastRenderedPageBreak/>
               <w:t>15</w:t>
             </w:r>
           </w:p>
@@ -4551,7 +5406,6 @@
         <w:spacing w:after="60"/>
       </w:pPr>
       <w:r>
-        <w:lastRenderedPageBreak/>
         <w:t>Email templates and who gets copied on escalations</w:t>
       </w:r>
     </w:p>
@@ -5455,15 +6309,7 @@
     <w:p/>
     <w:p>
       <w:r>
-        <w:t>(</w:t>
-      </w:r>
-      <w:proofErr w:type="gramStart"/>
-      <w:r>
-        <w:t>book keeping</w:t>
-      </w:r>
-      <w:proofErr w:type="gramEnd"/>
-      <w:r>
-        <w:t>)</w:t>
+        <w:t>(book keeping)</w:t>
       </w:r>
     </w:p>
     <w:p>
@@ -7566,7 +8412,7 @@
       </w:r>
     </w:p>
     <w:sectPr>
-      <w:footerReference w:type="default" r:id="rId8"/>
+      <w:footerReference w:type="default" r:id="rId9"/>
       <w:pgSz w:w="12240" w:h="15840"/>
       <w:pgMar w:top="1440" w:right="1440" w:bottom="1440" w:left="1440" w:header="708" w:footer="708" w:gutter="0"/>
       <w:cols w:space="720"/>
@@ -7607,25 +8453,7 @@
         <w:sz w:val="18"/>
         <w:szCs w:val="18"/>
       </w:rPr>
-      <w:t xml:space="preserve">Client Portal: Bookkeeping </w:t>
-    </w:r>
-    <w:proofErr w:type="gramStart"/>
-    <w:r>
-      <w:rPr>
-        <w:color w:val="808080"/>
-        <w:sz w:val="18"/>
-        <w:szCs w:val="18"/>
-      </w:rPr>
-      <w:t>Workflow  |</w:t>
-    </w:r>
-    <w:proofErr w:type="gramEnd"/>
-    <w:r>
-      <w:rPr>
-        <w:color w:val="808080"/>
-        <w:sz w:val="18"/>
-        <w:szCs w:val="18"/>
-      </w:rPr>
-      <w:t xml:space="preserve">  Page </w:t>
+      <w:t xml:space="preserve">Client Portal: Bookkeeping Workflow  |  Page </w:t>
     </w:r>
     <w:r>
       <w:rPr>
@@ -7694,6 +8522,417 @@
 <file path=word/numbering.xml><?xml version="1.0" encoding="utf-8"?>
 <w:numbering xmlns:wpc="http://schemas.microsoft.com/office/word/2010/wordprocessingCanvas" xmlns:cx="http://schemas.microsoft.com/office/drawing/2014/chartex" xmlns:cx1="http://schemas.microsoft.com/office/drawing/2015/9/8/chartex" xmlns:cx2="http://schemas.microsoft.com/office/drawing/2015/10/21/chartex" xmlns:cx3="http://schemas.microsoft.com/office/drawing/2016/5/9/chartex" xmlns:cx4="http://schemas.microsoft.com/office/drawing/2016/5/10/chartex" xmlns:cx5="http://schemas.microsoft.com/office/drawing/2016/5/11/chartex" xmlns:cx6="http://schemas.microsoft.com/office/drawing/2016/5/12/chartex" xmlns:cx7="http://schemas.microsoft.com/office/drawing/2016/5/13/chartex" xmlns:cx8="http://schemas.microsoft.com/office/drawing/2016/5/14/chartex" xmlns:mc="http://schemas.openxmlformats.org/markup-compatibility/2006" xmlns:aink="http://schemas.microsoft.com/office/drawing/2016/ink" xmlns:am3d="http://schemas.microsoft.com/office/drawing/2017/model3d" xmlns:o="urn:schemas-microsoft-com:office:office" xmlns:oel="http://schemas.microsoft.com/office/2019/extlst" xmlns:r="http://schemas.openxmlformats.org/officeDocument/2006/relationships" xmlns:m="http://schemas.openxmlformats.org/officeDocument/2006/math" xmlns:v="urn:schemas-microsoft-com:vml" xmlns:wp14="http://schemas.microsoft.com/office/word/2010/wordprocessingDrawing" xmlns:wp="http://schemas.openxmlformats.org/drawingml/2006/wordprocessingDrawing" xmlns:w10="urn:schemas-microsoft-com:office:word" xmlns:w="http://schemas.openxmlformats.org/wordprocessingml/2006/main" xmlns:w14="http://schemas.microsoft.com/office/word/2010/wordml" xmlns:w15="http://schemas.microsoft.com/office/word/2012/wordml" xmlns:w16cex="http://schemas.microsoft.com/office/word/2018/wordml/cex" xmlns:w16cid="http://schemas.microsoft.com/office/word/2016/wordml/cid" xmlns:w16="http://schemas.microsoft.com/office/word/2018/wordml" xmlns:w16du="http://schemas.microsoft.com/office/word/2023/wordml/word16du" xmlns:w16sdtdh="http://schemas.microsoft.com/office/word/2020/wordml/sdtdatahash" xmlns:w16sdtfl="http://schemas.microsoft.com/office/word/2024/wordml/sdtformatlock" xmlns:w16se="http://schemas.microsoft.com/office/word/2015/wordml/symex" xmlns:wpg="http://schemas.microsoft.com/office/word/2010/wordprocessingGroup" xmlns:wpi="http://schemas.microsoft.com/office/word/2010/wordprocessingInk" xmlns:wne="http://schemas.microsoft.com/office/word/2006/wordml" xmlns:wps="http://schemas.microsoft.com/office/word/2010/wordprocessingShape" mc:Ignorable="w14 w15 w16se w16cid w16 w16cex w16sdtdh w16sdtfl w16du wp14">
   <w:abstractNum w:abstractNumId="0" w15:restartNumberingAfterBreak="0">
+    <w:nsid w:val="1AED1C0D"/>
+    <w:multiLevelType w:val="multilevel"/>
+    <w:tmpl w:val="B740888C"/>
+    <w:lvl w:ilvl="0">
+      <w:start w:val="1"/>
+      <w:numFmt w:val="bullet"/>
+      <w:lvlText w:val=""/>
+      <w:lvlJc w:val="left"/>
+      <w:pPr>
+        <w:tabs>
+          <w:tab w:val="num" w:pos="720"/>
+        </w:tabs>
+        <w:ind w:left="720" w:hanging="360"/>
+      </w:pPr>
+      <w:rPr>
+        <w:rFonts w:ascii="Symbol" w:hAnsi="Symbol" w:hint="default"/>
+        <w:sz w:val="20"/>
+      </w:rPr>
+    </w:lvl>
+    <w:lvl w:ilvl="1" w:tentative="1">
+      <w:start w:val="1"/>
+      <w:numFmt w:val="bullet"/>
+      <w:lvlText w:val="o"/>
+      <w:lvlJc w:val="left"/>
+      <w:pPr>
+        <w:tabs>
+          <w:tab w:val="num" w:pos="1440"/>
+        </w:tabs>
+        <w:ind w:left="1440" w:hanging="360"/>
+      </w:pPr>
+      <w:rPr>
+        <w:rFonts w:ascii="Courier New" w:hAnsi="Courier New" w:hint="default"/>
+        <w:sz w:val="20"/>
+      </w:rPr>
+    </w:lvl>
+    <w:lvl w:ilvl="2" w:tentative="1">
+      <w:start w:val="1"/>
+      <w:numFmt w:val="bullet"/>
+      <w:lvlText w:val=""/>
+      <w:lvlJc w:val="left"/>
+      <w:pPr>
+        <w:tabs>
+          <w:tab w:val="num" w:pos="2160"/>
+        </w:tabs>
+        <w:ind w:left="2160" w:hanging="360"/>
+      </w:pPr>
+      <w:rPr>
+        <w:rFonts w:ascii="Wingdings" w:hAnsi="Wingdings" w:hint="default"/>
+        <w:sz w:val="20"/>
+      </w:rPr>
+    </w:lvl>
+    <w:lvl w:ilvl="3" w:tentative="1">
+      <w:start w:val="1"/>
+      <w:numFmt w:val="bullet"/>
+      <w:lvlText w:val=""/>
+      <w:lvlJc w:val="left"/>
+      <w:pPr>
+        <w:tabs>
+          <w:tab w:val="num" w:pos="2880"/>
+        </w:tabs>
+        <w:ind w:left="2880" w:hanging="360"/>
+      </w:pPr>
+      <w:rPr>
+        <w:rFonts w:ascii="Wingdings" w:hAnsi="Wingdings" w:hint="default"/>
+        <w:sz w:val="20"/>
+      </w:rPr>
+    </w:lvl>
+    <w:lvl w:ilvl="4" w:tentative="1">
+      <w:start w:val="1"/>
+      <w:numFmt w:val="bullet"/>
+      <w:lvlText w:val=""/>
+      <w:lvlJc w:val="left"/>
+      <w:pPr>
+        <w:tabs>
+          <w:tab w:val="num" w:pos="3600"/>
+        </w:tabs>
+        <w:ind w:left="3600" w:hanging="360"/>
+      </w:pPr>
+      <w:rPr>
+        <w:rFonts w:ascii="Wingdings" w:hAnsi="Wingdings" w:hint="default"/>
+        <w:sz w:val="20"/>
+      </w:rPr>
+    </w:lvl>
+    <w:lvl w:ilvl="5" w:tentative="1">
+      <w:start w:val="1"/>
+      <w:numFmt w:val="bullet"/>
+      <w:lvlText w:val=""/>
+      <w:lvlJc w:val="left"/>
+      <w:pPr>
+        <w:tabs>
+          <w:tab w:val="num" w:pos="4320"/>
+        </w:tabs>
+        <w:ind w:left="4320" w:hanging="360"/>
+      </w:pPr>
+      <w:rPr>
+        <w:rFonts w:ascii="Wingdings" w:hAnsi="Wingdings" w:hint="default"/>
+        <w:sz w:val="20"/>
+      </w:rPr>
+    </w:lvl>
+    <w:lvl w:ilvl="6" w:tentative="1">
+      <w:start w:val="1"/>
+      <w:numFmt w:val="bullet"/>
+      <w:lvlText w:val=""/>
+      <w:lvlJc w:val="left"/>
+      <w:pPr>
+        <w:tabs>
+          <w:tab w:val="num" w:pos="5040"/>
+        </w:tabs>
+        <w:ind w:left="5040" w:hanging="360"/>
+      </w:pPr>
+      <w:rPr>
+        <w:rFonts w:ascii="Wingdings" w:hAnsi="Wingdings" w:hint="default"/>
+        <w:sz w:val="20"/>
+      </w:rPr>
+    </w:lvl>
+    <w:lvl w:ilvl="7" w:tentative="1">
+      <w:start w:val="1"/>
+      <w:numFmt w:val="bullet"/>
+      <w:lvlText w:val=""/>
+      <w:lvlJc w:val="left"/>
+      <w:pPr>
+        <w:tabs>
+          <w:tab w:val="num" w:pos="5760"/>
+        </w:tabs>
+        <w:ind w:left="5760" w:hanging="360"/>
+      </w:pPr>
+      <w:rPr>
+        <w:rFonts w:ascii="Wingdings" w:hAnsi="Wingdings" w:hint="default"/>
+        <w:sz w:val="20"/>
+      </w:rPr>
+    </w:lvl>
+    <w:lvl w:ilvl="8" w:tentative="1">
+      <w:start w:val="1"/>
+      <w:numFmt w:val="bullet"/>
+      <w:lvlText w:val=""/>
+      <w:lvlJc w:val="left"/>
+      <w:pPr>
+        <w:tabs>
+          <w:tab w:val="num" w:pos="6480"/>
+        </w:tabs>
+        <w:ind w:left="6480" w:hanging="360"/>
+      </w:pPr>
+      <w:rPr>
+        <w:rFonts w:ascii="Wingdings" w:hAnsi="Wingdings" w:hint="default"/>
+        <w:sz w:val="20"/>
+      </w:rPr>
+    </w:lvl>
+  </w:abstractNum>
+  <w:abstractNum w:abstractNumId="1" w15:restartNumberingAfterBreak="0">
+    <w:nsid w:val="1C632623"/>
+    <w:multiLevelType w:val="multilevel"/>
+    <w:tmpl w:val="7FEABC9A"/>
+    <w:lvl w:ilvl="0">
+      <w:start w:val="1"/>
+      <w:numFmt w:val="bullet"/>
+      <w:lvlText w:val=""/>
+      <w:lvlJc w:val="left"/>
+      <w:pPr>
+        <w:tabs>
+          <w:tab w:val="num" w:pos="720"/>
+        </w:tabs>
+        <w:ind w:left="720" w:hanging="360"/>
+      </w:pPr>
+      <w:rPr>
+        <w:rFonts w:ascii="Symbol" w:hAnsi="Symbol" w:hint="default"/>
+        <w:sz w:val="20"/>
+      </w:rPr>
+    </w:lvl>
+    <w:lvl w:ilvl="1" w:tentative="1">
+      <w:start w:val="1"/>
+      <w:numFmt w:val="bullet"/>
+      <w:lvlText w:val="o"/>
+      <w:lvlJc w:val="left"/>
+      <w:pPr>
+        <w:tabs>
+          <w:tab w:val="num" w:pos="1440"/>
+        </w:tabs>
+        <w:ind w:left="1440" w:hanging="360"/>
+      </w:pPr>
+      <w:rPr>
+        <w:rFonts w:ascii="Courier New" w:hAnsi="Courier New" w:hint="default"/>
+        <w:sz w:val="20"/>
+      </w:rPr>
+    </w:lvl>
+    <w:lvl w:ilvl="2" w:tentative="1">
+      <w:start w:val="1"/>
+      <w:numFmt w:val="bullet"/>
+      <w:lvlText w:val=""/>
+      <w:lvlJc w:val="left"/>
+      <w:pPr>
+        <w:tabs>
+          <w:tab w:val="num" w:pos="2160"/>
+        </w:tabs>
+        <w:ind w:left="2160" w:hanging="360"/>
+      </w:pPr>
+      <w:rPr>
+        <w:rFonts w:ascii="Wingdings" w:hAnsi="Wingdings" w:hint="default"/>
+        <w:sz w:val="20"/>
+      </w:rPr>
+    </w:lvl>
+    <w:lvl w:ilvl="3" w:tentative="1">
+      <w:start w:val="1"/>
+      <w:numFmt w:val="bullet"/>
+      <w:lvlText w:val=""/>
+      <w:lvlJc w:val="left"/>
+      <w:pPr>
+        <w:tabs>
+          <w:tab w:val="num" w:pos="2880"/>
+        </w:tabs>
+        <w:ind w:left="2880" w:hanging="360"/>
+      </w:pPr>
+      <w:rPr>
+        <w:rFonts w:ascii="Wingdings" w:hAnsi="Wingdings" w:hint="default"/>
+        <w:sz w:val="20"/>
+      </w:rPr>
+    </w:lvl>
+    <w:lvl w:ilvl="4" w:tentative="1">
+      <w:start w:val="1"/>
+      <w:numFmt w:val="bullet"/>
+      <w:lvlText w:val=""/>
+      <w:lvlJc w:val="left"/>
+      <w:pPr>
+        <w:tabs>
+          <w:tab w:val="num" w:pos="3600"/>
+        </w:tabs>
+        <w:ind w:left="3600" w:hanging="360"/>
+      </w:pPr>
+      <w:rPr>
+        <w:rFonts w:ascii="Wingdings" w:hAnsi="Wingdings" w:hint="default"/>
+        <w:sz w:val="20"/>
+      </w:rPr>
+    </w:lvl>
+    <w:lvl w:ilvl="5" w:tentative="1">
+      <w:start w:val="1"/>
+      <w:numFmt w:val="bullet"/>
+      <w:lvlText w:val=""/>
+      <w:lvlJc w:val="left"/>
+      <w:pPr>
+        <w:tabs>
+          <w:tab w:val="num" w:pos="4320"/>
+        </w:tabs>
+        <w:ind w:left="4320" w:hanging="360"/>
+      </w:pPr>
+      <w:rPr>
+        <w:rFonts w:ascii="Wingdings" w:hAnsi="Wingdings" w:hint="default"/>
+        <w:sz w:val="20"/>
+      </w:rPr>
+    </w:lvl>
+    <w:lvl w:ilvl="6" w:tentative="1">
+      <w:start w:val="1"/>
+      <w:numFmt w:val="bullet"/>
+      <w:lvlText w:val=""/>
+      <w:lvlJc w:val="left"/>
+      <w:pPr>
+        <w:tabs>
+          <w:tab w:val="num" w:pos="5040"/>
+        </w:tabs>
+        <w:ind w:left="5040" w:hanging="360"/>
+      </w:pPr>
+      <w:rPr>
+        <w:rFonts w:ascii="Wingdings" w:hAnsi="Wingdings" w:hint="default"/>
+        <w:sz w:val="20"/>
+      </w:rPr>
+    </w:lvl>
+    <w:lvl w:ilvl="7" w:tentative="1">
+      <w:start w:val="1"/>
+      <w:numFmt w:val="bullet"/>
+      <w:lvlText w:val=""/>
+      <w:lvlJc w:val="left"/>
+      <w:pPr>
+        <w:tabs>
+          <w:tab w:val="num" w:pos="5760"/>
+        </w:tabs>
+        <w:ind w:left="5760" w:hanging="360"/>
+      </w:pPr>
+      <w:rPr>
+        <w:rFonts w:ascii="Wingdings" w:hAnsi="Wingdings" w:hint="default"/>
+        <w:sz w:val="20"/>
+      </w:rPr>
+    </w:lvl>
+    <w:lvl w:ilvl="8" w:tentative="1">
+      <w:start w:val="1"/>
+      <w:numFmt w:val="bullet"/>
+      <w:lvlText w:val=""/>
+      <w:lvlJc w:val="left"/>
+      <w:pPr>
+        <w:tabs>
+          <w:tab w:val="num" w:pos="6480"/>
+        </w:tabs>
+        <w:ind w:left="6480" w:hanging="360"/>
+      </w:pPr>
+      <w:rPr>
+        <w:rFonts w:ascii="Wingdings" w:hAnsi="Wingdings" w:hint="default"/>
+        <w:sz w:val="20"/>
+      </w:rPr>
+    </w:lvl>
+  </w:abstractNum>
+  <w:abstractNum w:abstractNumId="2" w15:restartNumberingAfterBreak="0">
+    <w:nsid w:val="23941CC0"/>
+    <w:multiLevelType w:val="multilevel"/>
+    <w:tmpl w:val="346ECAC2"/>
+    <w:lvl w:ilvl="0">
+      <w:start w:val="1"/>
+      <w:numFmt w:val="decimal"/>
+      <w:lvlText w:val="%1."/>
+      <w:lvlJc w:val="left"/>
+      <w:pPr>
+        <w:tabs>
+          <w:tab w:val="num" w:pos="720"/>
+        </w:tabs>
+        <w:ind w:left="720" w:hanging="360"/>
+      </w:pPr>
+    </w:lvl>
+    <w:lvl w:ilvl="1" w:tentative="1">
+      <w:start w:val="1"/>
+      <w:numFmt w:val="decimal"/>
+      <w:lvlText w:val="%2."/>
+      <w:lvlJc w:val="left"/>
+      <w:pPr>
+        <w:tabs>
+          <w:tab w:val="num" w:pos="1440"/>
+        </w:tabs>
+        <w:ind w:left="1440" w:hanging="360"/>
+      </w:pPr>
+    </w:lvl>
+    <w:lvl w:ilvl="2" w:tentative="1">
+      <w:start w:val="1"/>
+      <w:numFmt w:val="decimal"/>
+      <w:lvlText w:val="%3."/>
+      <w:lvlJc w:val="left"/>
+      <w:pPr>
+        <w:tabs>
+          <w:tab w:val="num" w:pos="2160"/>
+        </w:tabs>
+        <w:ind w:left="2160" w:hanging="360"/>
+      </w:pPr>
+    </w:lvl>
+    <w:lvl w:ilvl="3" w:tentative="1">
+      <w:start w:val="1"/>
+      <w:numFmt w:val="decimal"/>
+      <w:lvlText w:val="%4."/>
+      <w:lvlJc w:val="left"/>
+      <w:pPr>
+        <w:tabs>
+          <w:tab w:val="num" w:pos="2880"/>
+        </w:tabs>
+        <w:ind w:left="2880" w:hanging="360"/>
+      </w:pPr>
+    </w:lvl>
+    <w:lvl w:ilvl="4" w:tentative="1">
+      <w:start w:val="1"/>
+      <w:numFmt w:val="decimal"/>
+      <w:lvlText w:val="%5."/>
+      <w:lvlJc w:val="left"/>
+      <w:pPr>
+        <w:tabs>
+          <w:tab w:val="num" w:pos="3600"/>
+        </w:tabs>
+        <w:ind w:left="3600" w:hanging="360"/>
+      </w:pPr>
+    </w:lvl>
+    <w:lvl w:ilvl="5" w:tentative="1">
+      <w:start w:val="1"/>
+      <w:numFmt w:val="decimal"/>
+      <w:lvlText w:val="%6."/>
+      <w:lvlJc w:val="left"/>
+      <w:pPr>
+        <w:tabs>
+          <w:tab w:val="num" w:pos="4320"/>
+        </w:tabs>
+        <w:ind w:left="4320" w:hanging="360"/>
+      </w:pPr>
+    </w:lvl>
+    <w:lvl w:ilvl="6" w:tentative="1">
+      <w:start w:val="1"/>
+      <w:numFmt w:val="decimal"/>
+      <w:lvlText w:val="%7."/>
+      <w:lvlJc w:val="left"/>
+      <w:pPr>
+        <w:tabs>
+          <w:tab w:val="num" w:pos="5040"/>
+        </w:tabs>
+        <w:ind w:left="5040" w:hanging="360"/>
+      </w:pPr>
+    </w:lvl>
+    <w:lvl w:ilvl="7" w:tentative="1">
+      <w:start w:val="1"/>
+      <w:numFmt w:val="decimal"/>
+      <w:lvlText w:val="%8."/>
+      <w:lvlJc w:val="left"/>
+      <w:pPr>
+        <w:tabs>
+          <w:tab w:val="num" w:pos="5760"/>
+        </w:tabs>
+        <w:ind w:left="5760" w:hanging="360"/>
+      </w:pPr>
+    </w:lvl>
+    <w:lvl w:ilvl="8" w:tentative="1">
+      <w:start w:val="1"/>
+      <w:numFmt w:val="decimal"/>
+      <w:lvlText w:val="%9."/>
+      <w:lvlJc w:val="left"/>
+      <w:pPr>
+        <w:tabs>
+          <w:tab w:val="num" w:pos="6480"/>
+        </w:tabs>
+        <w:ind w:left="6480" w:hanging="360"/>
+      </w:pPr>
+    </w:lvl>
+  </w:abstractNum>
+  <w:abstractNum w:abstractNumId="3" w15:restartNumberingAfterBreak="0">
     <w:nsid w:val="44E849B6"/>
     <w:multiLevelType w:val="hybridMultilevel"/>
     <w:tmpl w:val="2572EE90"/>
@@ -7779,7 +9018,305 @@
       </w:pPr>
     </w:lvl>
   </w:abstractNum>
-  <w:abstractNum w:abstractNumId="1" w15:restartNumberingAfterBreak="0">
+  <w:abstractNum w:abstractNumId="4" w15:restartNumberingAfterBreak="0">
+    <w:nsid w:val="63C538DC"/>
+    <w:multiLevelType w:val="multilevel"/>
+    <w:tmpl w:val="11FC503C"/>
+    <w:lvl w:ilvl="0">
+      <w:start w:val="1"/>
+      <w:numFmt w:val="bullet"/>
+      <w:lvlText w:val=""/>
+      <w:lvlJc w:val="left"/>
+      <w:pPr>
+        <w:tabs>
+          <w:tab w:val="num" w:pos="720"/>
+        </w:tabs>
+        <w:ind w:left="720" w:hanging="360"/>
+      </w:pPr>
+      <w:rPr>
+        <w:rFonts w:ascii="Symbol" w:hAnsi="Symbol" w:hint="default"/>
+        <w:sz w:val="20"/>
+      </w:rPr>
+    </w:lvl>
+    <w:lvl w:ilvl="1" w:tentative="1">
+      <w:start w:val="1"/>
+      <w:numFmt w:val="bullet"/>
+      <w:lvlText w:val="o"/>
+      <w:lvlJc w:val="left"/>
+      <w:pPr>
+        <w:tabs>
+          <w:tab w:val="num" w:pos="1440"/>
+        </w:tabs>
+        <w:ind w:left="1440" w:hanging="360"/>
+      </w:pPr>
+      <w:rPr>
+        <w:rFonts w:ascii="Courier New" w:hAnsi="Courier New" w:hint="default"/>
+        <w:sz w:val="20"/>
+      </w:rPr>
+    </w:lvl>
+    <w:lvl w:ilvl="2" w:tentative="1">
+      <w:start w:val="1"/>
+      <w:numFmt w:val="bullet"/>
+      <w:lvlText w:val=""/>
+      <w:lvlJc w:val="left"/>
+      <w:pPr>
+        <w:tabs>
+          <w:tab w:val="num" w:pos="2160"/>
+        </w:tabs>
+        <w:ind w:left="2160" w:hanging="360"/>
+      </w:pPr>
+      <w:rPr>
+        <w:rFonts w:ascii="Wingdings" w:hAnsi="Wingdings" w:hint="default"/>
+        <w:sz w:val="20"/>
+      </w:rPr>
+    </w:lvl>
+    <w:lvl w:ilvl="3" w:tentative="1">
+      <w:start w:val="1"/>
+      <w:numFmt w:val="bullet"/>
+      <w:lvlText w:val=""/>
+      <w:lvlJc w:val="left"/>
+      <w:pPr>
+        <w:tabs>
+          <w:tab w:val="num" w:pos="2880"/>
+        </w:tabs>
+        <w:ind w:left="2880" w:hanging="360"/>
+      </w:pPr>
+      <w:rPr>
+        <w:rFonts w:ascii="Wingdings" w:hAnsi="Wingdings" w:hint="default"/>
+        <w:sz w:val="20"/>
+      </w:rPr>
+    </w:lvl>
+    <w:lvl w:ilvl="4" w:tentative="1">
+      <w:start w:val="1"/>
+      <w:numFmt w:val="bullet"/>
+      <w:lvlText w:val=""/>
+      <w:lvlJc w:val="left"/>
+      <w:pPr>
+        <w:tabs>
+          <w:tab w:val="num" w:pos="3600"/>
+        </w:tabs>
+        <w:ind w:left="3600" w:hanging="360"/>
+      </w:pPr>
+      <w:rPr>
+        <w:rFonts w:ascii="Wingdings" w:hAnsi="Wingdings" w:hint="default"/>
+        <w:sz w:val="20"/>
+      </w:rPr>
+    </w:lvl>
+    <w:lvl w:ilvl="5" w:tentative="1">
+      <w:start w:val="1"/>
+      <w:numFmt w:val="bullet"/>
+      <w:lvlText w:val=""/>
+      <w:lvlJc w:val="left"/>
+      <w:pPr>
+        <w:tabs>
+          <w:tab w:val="num" w:pos="4320"/>
+        </w:tabs>
+        <w:ind w:left="4320" w:hanging="360"/>
+      </w:pPr>
+      <w:rPr>
+        <w:rFonts w:ascii="Wingdings" w:hAnsi="Wingdings" w:hint="default"/>
+        <w:sz w:val="20"/>
+      </w:rPr>
+    </w:lvl>
+    <w:lvl w:ilvl="6" w:tentative="1">
+      <w:start w:val="1"/>
+      <w:numFmt w:val="bullet"/>
+      <w:lvlText w:val=""/>
+      <w:lvlJc w:val="left"/>
+      <w:pPr>
+        <w:tabs>
+          <w:tab w:val="num" w:pos="5040"/>
+        </w:tabs>
+        <w:ind w:left="5040" w:hanging="360"/>
+      </w:pPr>
+      <w:rPr>
+        <w:rFonts w:ascii="Wingdings" w:hAnsi="Wingdings" w:hint="default"/>
+        <w:sz w:val="20"/>
+      </w:rPr>
+    </w:lvl>
+    <w:lvl w:ilvl="7" w:tentative="1">
+      <w:start w:val="1"/>
+      <w:numFmt w:val="bullet"/>
+      <w:lvlText w:val=""/>
+      <w:lvlJc w:val="left"/>
+      <w:pPr>
+        <w:tabs>
+          <w:tab w:val="num" w:pos="5760"/>
+        </w:tabs>
+        <w:ind w:left="5760" w:hanging="360"/>
+      </w:pPr>
+      <w:rPr>
+        <w:rFonts w:ascii="Wingdings" w:hAnsi="Wingdings" w:hint="default"/>
+        <w:sz w:val="20"/>
+      </w:rPr>
+    </w:lvl>
+    <w:lvl w:ilvl="8" w:tentative="1">
+      <w:start w:val="1"/>
+      <w:numFmt w:val="bullet"/>
+      <w:lvlText w:val=""/>
+      <w:lvlJc w:val="left"/>
+      <w:pPr>
+        <w:tabs>
+          <w:tab w:val="num" w:pos="6480"/>
+        </w:tabs>
+        <w:ind w:left="6480" w:hanging="360"/>
+      </w:pPr>
+      <w:rPr>
+        <w:rFonts w:ascii="Wingdings" w:hAnsi="Wingdings" w:hint="default"/>
+        <w:sz w:val="20"/>
+      </w:rPr>
+    </w:lvl>
+  </w:abstractNum>
+  <w:abstractNum w:abstractNumId="5" w15:restartNumberingAfterBreak="0">
+    <w:nsid w:val="656640EA"/>
+    <w:multiLevelType w:val="multilevel"/>
+    <w:tmpl w:val="38C8D574"/>
+    <w:lvl w:ilvl="0">
+      <w:start w:val="1"/>
+      <w:numFmt w:val="bullet"/>
+      <w:lvlText w:val=""/>
+      <w:lvlJc w:val="left"/>
+      <w:pPr>
+        <w:tabs>
+          <w:tab w:val="num" w:pos="720"/>
+        </w:tabs>
+        <w:ind w:left="720" w:hanging="360"/>
+      </w:pPr>
+      <w:rPr>
+        <w:rFonts w:ascii="Symbol" w:hAnsi="Symbol" w:hint="default"/>
+        <w:sz w:val="20"/>
+      </w:rPr>
+    </w:lvl>
+    <w:lvl w:ilvl="1" w:tentative="1">
+      <w:start w:val="1"/>
+      <w:numFmt w:val="bullet"/>
+      <w:lvlText w:val="o"/>
+      <w:lvlJc w:val="left"/>
+      <w:pPr>
+        <w:tabs>
+          <w:tab w:val="num" w:pos="1440"/>
+        </w:tabs>
+        <w:ind w:left="1440" w:hanging="360"/>
+      </w:pPr>
+      <w:rPr>
+        <w:rFonts w:ascii="Courier New" w:hAnsi="Courier New" w:hint="default"/>
+        <w:sz w:val="20"/>
+      </w:rPr>
+    </w:lvl>
+    <w:lvl w:ilvl="2" w:tentative="1">
+      <w:start w:val="1"/>
+      <w:numFmt w:val="bullet"/>
+      <w:lvlText w:val=""/>
+      <w:lvlJc w:val="left"/>
+      <w:pPr>
+        <w:tabs>
+          <w:tab w:val="num" w:pos="2160"/>
+        </w:tabs>
+        <w:ind w:left="2160" w:hanging="360"/>
+      </w:pPr>
+      <w:rPr>
+        <w:rFonts w:ascii="Wingdings" w:hAnsi="Wingdings" w:hint="default"/>
+        <w:sz w:val="20"/>
+      </w:rPr>
+    </w:lvl>
+    <w:lvl w:ilvl="3" w:tentative="1">
+      <w:start w:val="1"/>
+      <w:numFmt w:val="bullet"/>
+      <w:lvlText w:val=""/>
+      <w:lvlJc w:val="left"/>
+      <w:pPr>
+        <w:tabs>
+          <w:tab w:val="num" w:pos="2880"/>
+        </w:tabs>
+        <w:ind w:left="2880" w:hanging="360"/>
+      </w:pPr>
+      <w:rPr>
+        <w:rFonts w:ascii="Wingdings" w:hAnsi="Wingdings" w:hint="default"/>
+        <w:sz w:val="20"/>
+      </w:rPr>
+    </w:lvl>
+    <w:lvl w:ilvl="4" w:tentative="1">
+      <w:start w:val="1"/>
+      <w:numFmt w:val="bullet"/>
+      <w:lvlText w:val=""/>
+      <w:lvlJc w:val="left"/>
+      <w:pPr>
+        <w:tabs>
+          <w:tab w:val="num" w:pos="3600"/>
+        </w:tabs>
+        <w:ind w:left="3600" w:hanging="360"/>
+      </w:pPr>
+      <w:rPr>
+        <w:rFonts w:ascii="Wingdings" w:hAnsi="Wingdings" w:hint="default"/>
+        <w:sz w:val="20"/>
+      </w:rPr>
+    </w:lvl>
+    <w:lvl w:ilvl="5" w:tentative="1">
+      <w:start w:val="1"/>
+      <w:numFmt w:val="bullet"/>
+      <w:lvlText w:val=""/>
+      <w:lvlJc w:val="left"/>
+      <w:pPr>
+        <w:tabs>
+          <w:tab w:val="num" w:pos="4320"/>
+        </w:tabs>
+        <w:ind w:left="4320" w:hanging="360"/>
+      </w:pPr>
+      <w:rPr>
+        <w:rFonts w:ascii="Wingdings" w:hAnsi="Wingdings" w:hint="default"/>
+        <w:sz w:val="20"/>
+      </w:rPr>
+    </w:lvl>
+    <w:lvl w:ilvl="6" w:tentative="1">
+      <w:start w:val="1"/>
+      <w:numFmt w:val="bullet"/>
+      <w:lvlText w:val=""/>
+      <w:lvlJc w:val="left"/>
+      <w:pPr>
+        <w:tabs>
+          <w:tab w:val="num" w:pos="5040"/>
+        </w:tabs>
+        <w:ind w:left="5040" w:hanging="360"/>
+      </w:pPr>
+      <w:rPr>
+        <w:rFonts w:ascii="Wingdings" w:hAnsi="Wingdings" w:hint="default"/>
+        <w:sz w:val="20"/>
+      </w:rPr>
+    </w:lvl>
+    <w:lvl w:ilvl="7" w:tentative="1">
+      <w:start w:val="1"/>
+      <w:numFmt w:val="bullet"/>
+      <w:lvlText w:val=""/>
+      <w:lvlJc w:val="left"/>
+      <w:pPr>
+        <w:tabs>
+          <w:tab w:val="num" w:pos="5760"/>
+        </w:tabs>
+        <w:ind w:left="5760" w:hanging="360"/>
+      </w:pPr>
+      <w:rPr>
+        <w:rFonts w:ascii="Wingdings" w:hAnsi="Wingdings" w:hint="default"/>
+        <w:sz w:val="20"/>
+      </w:rPr>
+    </w:lvl>
+    <w:lvl w:ilvl="8" w:tentative="1">
+      <w:start w:val="1"/>
+      <w:numFmt w:val="bullet"/>
+      <w:lvlText w:val=""/>
+      <w:lvlJc w:val="left"/>
+      <w:pPr>
+        <w:tabs>
+          <w:tab w:val="num" w:pos="6480"/>
+        </w:tabs>
+        <w:ind w:left="6480" w:hanging="360"/>
+      </w:pPr>
+      <w:rPr>
+        <w:rFonts w:ascii="Wingdings" w:hAnsi="Wingdings" w:hint="default"/>
+        <w:sz w:val="20"/>
+      </w:rPr>
+    </w:lvl>
+  </w:abstractNum>
+  <w:abstractNum w:abstractNumId="6" w15:restartNumberingAfterBreak="0">
     <w:nsid w:val="6F100578"/>
     <w:multiLevelType w:val="hybridMultilevel"/>
     <w:tmpl w:val="0F42DA86"/>
@@ -7833,17 +9370,184 @@
       <w:lvlJc w:val="left"/>
     </w:lvl>
   </w:abstractNum>
+  <w:abstractNum w:abstractNumId="7" w15:restartNumberingAfterBreak="0">
+    <w:nsid w:val="7DD64D4D"/>
+    <w:multiLevelType w:val="multilevel"/>
+    <w:tmpl w:val="A8F2F69C"/>
+    <w:lvl w:ilvl="0">
+      <w:start w:val="1"/>
+      <w:numFmt w:val="bullet"/>
+      <w:lvlText w:val=""/>
+      <w:lvlJc w:val="left"/>
+      <w:pPr>
+        <w:tabs>
+          <w:tab w:val="num" w:pos="720"/>
+        </w:tabs>
+        <w:ind w:left="720" w:hanging="360"/>
+      </w:pPr>
+      <w:rPr>
+        <w:rFonts w:ascii="Symbol" w:hAnsi="Symbol" w:hint="default"/>
+        <w:sz w:val="20"/>
+      </w:rPr>
+    </w:lvl>
+    <w:lvl w:ilvl="1" w:tentative="1">
+      <w:start w:val="1"/>
+      <w:numFmt w:val="bullet"/>
+      <w:lvlText w:val="o"/>
+      <w:lvlJc w:val="left"/>
+      <w:pPr>
+        <w:tabs>
+          <w:tab w:val="num" w:pos="1440"/>
+        </w:tabs>
+        <w:ind w:left="1440" w:hanging="360"/>
+      </w:pPr>
+      <w:rPr>
+        <w:rFonts w:ascii="Courier New" w:hAnsi="Courier New" w:hint="default"/>
+        <w:sz w:val="20"/>
+      </w:rPr>
+    </w:lvl>
+    <w:lvl w:ilvl="2" w:tentative="1">
+      <w:start w:val="1"/>
+      <w:numFmt w:val="bullet"/>
+      <w:lvlText w:val=""/>
+      <w:lvlJc w:val="left"/>
+      <w:pPr>
+        <w:tabs>
+          <w:tab w:val="num" w:pos="2160"/>
+        </w:tabs>
+        <w:ind w:left="2160" w:hanging="360"/>
+      </w:pPr>
+      <w:rPr>
+        <w:rFonts w:ascii="Wingdings" w:hAnsi="Wingdings" w:hint="default"/>
+        <w:sz w:val="20"/>
+      </w:rPr>
+    </w:lvl>
+    <w:lvl w:ilvl="3" w:tentative="1">
+      <w:start w:val="1"/>
+      <w:numFmt w:val="bullet"/>
+      <w:lvlText w:val=""/>
+      <w:lvlJc w:val="left"/>
+      <w:pPr>
+        <w:tabs>
+          <w:tab w:val="num" w:pos="2880"/>
+        </w:tabs>
+        <w:ind w:left="2880" w:hanging="360"/>
+      </w:pPr>
+      <w:rPr>
+        <w:rFonts w:ascii="Wingdings" w:hAnsi="Wingdings" w:hint="default"/>
+        <w:sz w:val="20"/>
+      </w:rPr>
+    </w:lvl>
+    <w:lvl w:ilvl="4" w:tentative="1">
+      <w:start w:val="1"/>
+      <w:numFmt w:val="bullet"/>
+      <w:lvlText w:val=""/>
+      <w:lvlJc w:val="left"/>
+      <w:pPr>
+        <w:tabs>
+          <w:tab w:val="num" w:pos="3600"/>
+        </w:tabs>
+        <w:ind w:left="3600" w:hanging="360"/>
+      </w:pPr>
+      <w:rPr>
+        <w:rFonts w:ascii="Wingdings" w:hAnsi="Wingdings" w:hint="default"/>
+        <w:sz w:val="20"/>
+      </w:rPr>
+    </w:lvl>
+    <w:lvl w:ilvl="5" w:tentative="1">
+      <w:start w:val="1"/>
+      <w:numFmt w:val="bullet"/>
+      <w:lvlText w:val=""/>
+      <w:lvlJc w:val="left"/>
+      <w:pPr>
+        <w:tabs>
+          <w:tab w:val="num" w:pos="4320"/>
+        </w:tabs>
+        <w:ind w:left="4320" w:hanging="360"/>
+      </w:pPr>
+      <w:rPr>
+        <w:rFonts w:ascii="Wingdings" w:hAnsi="Wingdings" w:hint="default"/>
+        <w:sz w:val="20"/>
+      </w:rPr>
+    </w:lvl>
+    <w:lvl w:ilvl="6" w:tentative="1">
+      <w:start w:val="1"/>
+      <w:numFmt w:val="bullet"/>
+      <w:lvlText w:val=""/>
+      <w:lvlJc w:val="left"/>
+      <w:pPr>
+        <w:tabs>
+          <w:tab w:val="num" w:pos="5040"/>
+        </w:tabs>
+        <w:ind w:left="5040" w:hanging="360"/>
+      </w:pPr>
+      <w:rPr>
+        <w:rFonts w:ascii="Wingdings" w:hAnsi="Wingdings" w:hint="default"/>
+        <w:sz w:val="20"/>
+      </w:rPr>
+    </w:lvl>
+    <w:lvl w:ilvl="7" w:tentative="1">
+      <w:start w:val="1"/>
+      <w:numFmt w:val="bullet"/>
+      <w:lvlText w:val=""/>
+      <w:lvlJc w:val="left"/>
+      <w:pPr>
+        <w:tabs>
+          <w:tab w:val="num" w:pos="5760"/>
+        </w:tabs>
+        <w:ind w:left="5760" w:hanging="360"/>
+      </w:pPr>
+      <w:rPr>
+        <w:rFonts w:ascii="Wingdings" w:hAnsi="Wingdings" w:hint="default"/>
+        <w:sz w:val="20"/>
+      </w:rPr>
+    </w:lvl>
+    <w:lvl w:ilvl="8" w:tentative="1">
+      <w:start w:val="1"/>
+      <w:numFmt w:val="bullet"/>
+      <w:lvlText w:val=""/>
+      <w:lvlJc w:val="left"/>
+      <w:pPr>
+        <w:tabs>
+          <w:tab w:val="num" w:pos="6480"/>
+        </w:tabs>
+        <w:ind w:left="6480" w:hanging="360"/>
+      </w:pPr>
+      <w:rPr>
+        <w:rFonts w:ascii="Wingdings" w:hAnsi="Wingdings" w:hint="default"/>
+        <w:sz w:val="20"/>
+      </w:rPr>
+    </w:lvl>
+  </w:abstractNum>
   <w:num w:numId="1" w16cid:durableId="292100451">
-    <w:abstractNumId w:val="0"/>
+    <w:abstractNumId w:val="3"/>
     <w:lvlOverride w:ilvl="0">
       <w:startOverride w:val="1"/>
     </w:lvlOverride>
   </w:num>
   <w:num w:numId="2" w16cid:durableId="640382446">
-    <w:abstractNumId w:val="1"/>
+    <w:abstractNumId w:val="6"/>
     <w:lvlOverride w:ilvl="0">
       <w:startOverride w:val="1"/>
     </w:lvlOverride>
+  </w:num>
+  <w:num w:numId="3" w16cid:durableId="319162797">
+    <w:abstractNumId w:val="2"/>
+  </w:num>
+  <w:num w:numId="4" w16cid:durableId="909576542">
+    <w:abstractNumId w:val="4"/>
+  </w:num>
+  <w:num w:numId="5" w16cid:durableId="929852203">
+    <w:abstractNumId w:val="7"/>
+  </w:num>
+  <w:num w:numId="6" w16cid:durableId="2131435730">
+    <w:abstractNumId w:val="0"/>
+  </w:num>
+  <w:num w:numId="7" w16cid:durableId="1929924499">
+    <w:abstractNumId w:val="1"/>
+  </w:num>
+  <w:num w:numId="8" w16cid:durableId="491914123">
+    <w:abstractNumId w:val="5"/>
   </w:num>
 </w:numbering>
 </file>
@@ -8335,7 +10039,6 @@
   <w:style w:type="character" w:default="1" w:styleId="DefaultParagraphFont">
     <w:name w:val="Default Paragraph Font"/>
     <w:uiPriority w:val="1"/>
-    <w:semiHidden/>
     <w:unhideWhenUsed/>
   </w:style>
   <w:style w:type="table" w:default="1" w:styleId="TableNormal">

</xml_diff>